<commit_message>
docs: integrate specifications and traceability
</commit_message>
<xml_diff>
--- a/Insurance_Workflow_SAD.docx
+++ b/Insurance_Workflow_SAD.docx
@@ -43,7 +43,7 @@
           <w:b w:val="0"/>
           <w:sz w:val="22"/>
         </w:rPr>
-        <w:t>Team 07 | Version 1.0 | 12 October 2026</w:t>
+        <w:t>Team 07 | Version 1.1 | 12 October 2026</w:t>
       </w:r>
     </w:p>
     <w:p>
@@ -867,6 +867,107 @@
           </w:p>
         </w:tc>
       </w:tr>
+      <w:tr>
+        <w:trPr>
+          <w:cantSplit/>
+        </w:trPr>
+        <w:tc>
+          <w:tcPr>
+            <w:tcW w:type="dxa" w:w="2016"/>
+            <w:vAlign w:val="center"/>
+            <w:tcMar>
+              <w:top w:w="85" w:type="dxa"/>
+              <w:left w:w="85" w:type="dxa"/>
+              <w:bottom w:w="85" w:type="dxa"/>
+              <w:right w:w="85" w:type="dxa"/>
+            </w:tcMar>
+            <w:tcBorders>
+              <w:top w:val="single" w:sz="4" w:color="D9D9D9"/>
+              <w:left w:val="single" w:sz="4" w:color="D9D9D9"/>
+              <w:bottom w:val="single" w:sz="4" w:color="D9D9D9"/>
+              <w:right w:val="single" w:sz="4" w:color="D9D9D9"/>
+            </w:tcBorders>
+          </w:tcPr>
+          <w:p>
+            <w:pPr>
+              <w:spacing w:after="40" w:before="40" w:line="240" w:lineRule="auto"/>
+            </w:pPr>
+            <w:r>
+              <w:rPr>
+                <w:rFonts w:ascii="Calibri" w:hAnsi="Calibri"/>
+                <w:b w:val="0"/>
+                <w:color w:val="000000"/>
+                <w:sz w:val="20"/>
+              </w:rPr>
+              <w:t>1.1 / 12 October 2026</w:t>
+            </w:r>
+          </w:p>
+        </w:tc>
+        <w:tc>
+          <w:tcPr>
+            <w:tcW w:type="dxa" w:w="2376"/>
+            <w:vAlign w:val="center"/>
+            <w:tcMar>
+              <w:top w:w="85" w:type="dxa"/>
+              <w:left w:w="85" w:type="dxa"/>
+              <w:bottom w:w="85" w:type="dxa"/>
+              <w:right w:w="85" w:type="dxa"/>
+            </w:tcMar>
+            <w:tcBorders>
+              <w:top w:val="single" w:sz="4" w:color="D9D9D9"/>
+              <w:left w:val="single" w:sz="4" w:color="D9D9D9"/>
+              <w:bottom w:val="single" w:sz="4" w:color="D9D9D9"/>
+              <w:right w:val="single" w:sz="4" w:color="D9D9D9"/>
+            </w:tcBorders>
+          </w:tcPr>
+          <w:p>
+            <w:pPr>
+              <w:spacing w:after="40" w:before="40" w:line="240" w:lineRule="auto"/>
+            </w:pPr>
+            <w:r>
+              <w:rPr>
+                <w:rFonts w:ascii="Calibri" w:hAnsi="Calibri"/>
+                <w:b w:val="0"/>
+                <w:color w:val="000000"/>
+                <w:sz w:val="20"/>
+              </w:rPr>
+              <w:t>Anuj Srijan</w:t>
+            </w:r>
+          </w:p>
+        </w:tc>
+        <w:tc>
+          <w:tcPr>
+            <w:tcW w:type="dxa" w:w="4248"/>
+            <w:vAlign w:val="center"/>
+            <w:tcMar>
+              <w:top w:w="85" w:type="dxa"/>
+              <w:left w:w="85" w:type="dxa"/>
+              <w:bottom w:w="85" w:type="dxa"/>
+              <w:right w:w="85" w:type="dxa"/>
+            </w:tcMar>
+            <w:tcBorders>
+              <w:top w:val="single" w:sz="4" w:color="D9D9D9"/>
+              <w:left w:val="single" w:sz="4" w:color="D9D9D9"/>
+              <w:bottom w:val="single" w:sz="4" w:color="D9D9D9"/>
+              <w:right w:val="single" w:sz="4" w:color="D9D9D9"/>
+            </w:tcBorders>
+          </w:tcPr>
+          <w:p>
+            <w:pPr>
+              <w:spacing w:after="40" w:before="40" w:line="240" w:lineRule="auto"/>
+            </w:pPr>
+            <w:r>
+              <w:rPr>
+                <w:rFonts w:ascii="Calibri" w:hAnsi="Calibri"/>
+                <w:b w:val="0"/>
+                <w:color w:val="000000"/>
+                <w:sz w:val="20"/>
+              </w:rPr>
+              <w:t>Integrate requirement/component/test references and reconcile acceptance rules.</w:t>
+            </w:r>
+          </w:p>
+        </w:tc>
+      </w:tr>
     </w:tbl>
     <w:p>
       <w:pPr>
@@ -1372,7 +1473,7 @@
           <w:b w:val="0"/>
           <w:sz w:val="22"/>
         </w:rPr>
-        <w:t>Translate the SRS v1.0 proposed requirements into a reviewable architecture and detailed design. The SRS has not received recorded stakeholder sign-off; this SAD uses it as a provisional baseline, not an approved implementation contract.</w:t>
+        <w:t>Translate the SRS v1.1 proposed requirements into a reviewable architecture and detailed design. The SRS has not received recorded stakeholder sign-off; this SAD uses it as a provisional baseline, not an approved implementation contract.</w:t>
       </w:r>
     </w:p>
     <w:p>
@@ -3619,9 +3720,9 @@
         <w:tblLook w:firstColumn="1" w:firstRow="1" w:lastColumn="0" w:lastRow="0" w:noHBand="0" w:noVBand="1" w:val="04A0"/>
       </w:tblPr>
       <w:tblGrid>
-        <w:gridCol w:w="1728"/>
-        <w:gridCol w:w="2016"/>
-        <w:gridCol w:w="4896"/>
+        <w:gridCol w:w="1800"/>
+        <w:gridCol w:w="2160"/>
+        <w:gridCol w:w="4680"/>
       </w:tblGrid>
       <w:tr>
         <w:trPr>
@@ -3630,7 +3731,7 @@
         </w:trPr>
         <w:tc>
           <w:tcPr>
-            <w:tcW w:type="dxa" w:w="1728"/>
+            <w:tcW w:type="dxa" w:w="1800"/>
             <w:vAlign w:val="center"/>
             <w:tcMar>
               <w:top w:w="85" w:type="dxa"/>
@@ -3663,7 +3764,7 @@
         </w:tc>
         <w:tc>
           <w:tcPr>
-            <w:tcW w:type="dxa" w:w="2016"/>
+            <w:tcW w:type="dxa" w:w="2160"/>
             <w:vAlign w:val="center"/>
             <w:tcMar>
               <w:top w:w="85" w:type="dxa"/>
@@ -3696,7 +3797,7 @@
         </w:tc>
         <w:tc>
           <w:tcPr>
-            <w:tcW w:type="dxa" w:w="4896"/>
+            <w:tcW w:type="dxa" w:w="4680"/>
             <w:vAlign w:val="center"/>
             <w:tcMar>
               <w:top w:w="85" w:type="dxa"/>
@@ -3723,7 +3824,7 @@
                 <w:color w:val="000000"/>
                 <w:sz w:val="20"/>
               </w:rPr>
-              <w:t>Design responsibility</w:t>
+              <w:t>Planned STP tests</w:t>
             </w:r>
           </w:p>
         </w:tc>
@@ -3734,7 +3835,7 @@
         </w:trPr>
         <w:tc>
           <w:tcPr>
-            <w:tcW w:type="dxa" w:w="1728"/>
+            <w:tcW w:type="dxa" w:w="1800"/>
             <w:vAlign w:val="center"/>
             <w:tcMar>
               <w:top w:w="85" w:type="dxa"/>
@@ -3766,7 +3867,7 @@
         </w:tc>
         <w:tc>
           <w:tcPr>
-            <w:tcW w:type="dxa" w:w="2016"/>
+            <w:tcW w:type="dxa" w:w="2160"/>
             <w:vAlign w:val="center"/>
             <w:tcMar>
               <w:top w:w="85" w:type="dxa"/>
@@ -3798,33 +3899,33 @@
         </w:tc>
         <w:tc>
           <w:tcPr>
-            <w:tcW w:type="dxa" w:w="4896"/>
-            <w:vAlign w:val="center"/>
-            <w:tcMar>
-              <w:top w:w="85" w:type="dxa"/>
-              <w:left w:w="85" w:type="dxa"/>
-              <w:bottom w:w="85" w:type="dxa"/>
-              <w:right w:w="85" w:type="dxa"/>
-            </w:tcMar>
-            <w:tcBorders>
-              <w:top w:val="single" w:sz="4" w:color="D9D9D9"/>
-              <w:left w:val="single" w:sz="4" w:color="D9D9D9"/>
-              <w:bottom w:val="single" w:sz="4" w:color="D9D9D9"/>
-              <w:right w:val="single" w:sz="4" w:color="D9D9D9"/>
-            </w:tcBorders>
-          </w:tcPr>
-          <w:p>
-            <w:pPr>
-              <w:spacing w:after="40" w:before="40" w:line="240" w:lineRule="auto"/>
-            </w:pPr>
-            <w:r>
-              <w:rPr>
-                <w:rFonts w:ascii="Calibri" w:hAnsi="Calibri"/>
-                <w:b w:val="0"/>
-                <w:color w:val="000000"/>
-                <w:sz w:val="20"/>
-              </w:rPr>
-              <w:t>Account access</w:t>
+            <w:tcW w:type="dxa" w:w="4680"/>
+            <w:vAlign w:val="center"/>
+            <w:tcMar>
+              <w:top w:w="85" w:type="dxa"/>
+              <w:left w:w="85" w:type="dxa"/>
+              <w:bottom w:w="85" w:type="dxa"/>
+              <w:right w:w="85" w:type="dxa"/>
+            </w:tcMar>
+            <w:tcBorders>
+              <w:top w:val="single" w:sz="4" w:color="D9D9D9"/>
+              <w:left w:val="single" w:sz="4" w:color="D9D9D9"/>
+              <w:bottom w:val="single" w:sz="4" w:color="D9D9D9"/>
+              <w:right w:val="single" w:sz="4" w:color="D9D9D9"/>
+            </w:tcBorders>
+          </w:tcPr>
+          <w:p>
+            <w:pPr>
+              <w:spacing w:after="40" w:before="40" w:line="240" w:lineRule="auto"/>
+            </w:pPr>
+            <w:r>
+              <w:rPr>
+                <w:rFonts w:ascii="Calibri" w:hAnsi="Calibri"/>
+                <w:b w:val="0"/>
+                <w:color w:val="000000"/>
+                <w:sz w:val="20"/>
+              </w:rPr>
+              <w:t>TC-001</w:t>
             </w:r>
           </w:p>
         </w:tc>
@@ -3835,7 +3936,7 @@
         </w:trPr>
         <w:tc>
           <w:tcPr>
-            <w:tcW w:type="dxa" w:w="1728"/>
+            <w:tcW w:type="dxa" w:w="1800"/>
             <w:vAlign w:val="center"/>
             <w:tcMar>
               <w:top w:w="85" w:type="dxa"/>
@@ -3867,7 +3968,7 @@
         </w:tc>
         <w:tc>
           <w:tcPr>
-            <w:tcW w:type="dxa" w:w="2016"/>
+            <w:tcW w:type="dxa" w:w="2160"/>
             <w:vAlign w:val="center"/>
             <w:tcMar>
               <w:top w:w="85" w:type="dxa"/>
@@ -3899,33 +4000,33 @@
         </w:tc>
         <w:tc>
           <w:tcPr>
-            <w:tcW w:type="dxa" w:w="4896"/>
-            <w:vAlign w:val="center"/>
-            <w:tcMar>
-              <w:top w:w="85" w:type="dxa"/>
-              <w:left w:w="85" w:type="dxa"/>
-              <w:bottom w:w="85" w:type="dxa"/>
-              <w:right w:w="85" w:type="dxa"/>
-            </w:tcMar>
-            <w:tcBorders>
-              <w:top w:val="single" w:sz="4" w:color="D9D9D9"/>
-              <w:left w:val="single" w:sz="4" w:color="D9D9D9"/>
-              <w:bottom w:val="single" w:sz="4" w:color="D9D9D9"/>
-              <w:right w:val="single" w:sz="4" w:color="D9D9D9"/>
-            </w:tcBorders>
-          </w:tcPr>
-          <w:p>
-            <w:pPr>
-              <w:spacing w:after="40" w:before="40" w:line="240" w:lineRule="auto"/>
-            </w:pPr>
-            <w:r>
-              <w:rPr>
-                <w:rFonts w:ascii="Calibri" w:hAnsi="Calibri"/>
-                <w:b w:val="0"/>
-                <w:color w:val="000000"/>
-                <w:sz w:val="20"/>
-              </w:rPr>
-              <w:t>Application drafts</w:t>
+            <w:tcW w:type="dxa" w:w="4680"/>
+            <w:vAlign w:val="center"/>
+            <w:tcMar>
+              <w:top w:w="85" w:type="dxa"/>
+              <w:left w:w="85" w:type="dxa"/>
+              <w:bottom w:w="85" w:type="dxa"/>
+              <w:right w:w="85" w:type="dxa"/>
+            </w:tcMar>
+            <w:tcBorders>
+              <w:top w:val="single" w:sz="4" w:color="D9D9D9"/>
+              <w:left w:val="single" w:sz="4" w:color="D9D9D9"/>
+              <w:bottom w:val="single" w:sz="4" w:color="D9D9D9"/>
+              <w:right w:val="single" w:sz="4" w:color="D9D9D9"/>
+            </w:tcBorders>
+          </w:tcPr>
+          <w:p>
+            <w:pPr>
+              <w:spacing w:after="40" w:before="40" w:line="240" w:lineRule="auto"/>
+            </w:pPr>
+            <w:r>
+              <w:rPr>
+                <w:rFonts w:ascii="Calibri" w:hAnsi="Calibri"/>
+                <w:b w:val="0"/>
+                <w:color w:val="000000"/>
+                <w:sz w:val="20"/>
+              </w:rPr>
+              <w:t>TC-002</w:t>
             </w:r>
           </w:p>
         </w:tc>
@@ -3936,7 +4037,7 @@
         </w:trPr>
         <w:tc>
           <w:tcPr>
-            <w:tcW w:type="dxa" w:w="1728"/>
+            <w:tcW w:type="dxa" w:w="1800"/>
             <w:vAlign w:val="center"/>
             <w:tcMar>
               <w:top w:w="85" w:type="dxa"/>
@@ -3968,7 +4069,7 @@
         </w:tc>
         <w:tc>
           <w:tcPr>
-            <w:tcW w:type="dxa" w:w="2016"/>
+            <w:tcW w:type="dxa" w:w="2160"/>
             <w:vAlign w:val="center"/>
             <w:tcMar>
               <w:top w:w="85" w:type="dxa"/>
@@ -4000,33 +4101,33 @@
         </w:tc>
         <w:tc>
           <w:tcPr>
-            <w:tcW w:type="dxa" w:w="4896"/>
-            <w:vAlign w:val="center"/>
-            <w:tcMar>
-              <w:top w:w="85" w:type="dxa"/>
-              <w:left w:w="85" w:type="dxa"/>
-              <w:bottom w:w="85" w:type="dxa"/>
-              <w:right w:w="85" w:type="dxa"/>
-            </w:tcMar>
-            <w:tcBorders>
-              <w:top w:val="single" w:sz="4" w:color="D9D9D9"/>
-              <w:left w:val="single" w:sz="4" w:color="D9D9D9"/>
-              <w:bottom w:val="single" w:sz="4" w:color="D9D9D9"/>
-              <w:right w:val="single" w:sz="4" w:color="D9D9D9"/>
-            </w:tcBorders>
-          </w:tcPr>
-          <w:p>
-            <w:pPr>
-              <w:spacing w:after="40" w:before="40" w:line="240" w:lineRule="auto"/>
-            </w:pPr>
-            <w:r>
-              <w:rPr>
-                <w:rFonts w:ascii="Calibri" w:hAnsi="Calibri"/>
-                <w:b w:val="0"/>
-                <w:color w:val="000000"/>
-                <w:sz w:val="20"/>
-              </w:rPr>
-              <w:t>Application submission</w:t>
+            <w:tcW w:type="dxa" w:w="4680"/>
+            <w:vAlign w:val="center"/>
+            <w:tcMar>
+              <w:top w:w="85" w:type="dxa"/>
+              <w:left w:w="85" w:type="dxa"/>
+              <w:bottom w:w="85" w:type="dxa"/>
+              <w:right w:w="85" w:type="dxa"/>
+            </w:tcMar>
+            <w:tcBorders>
+              <w:top w:val="single" w:sz="4" w:color="D9D9D9"/>
+              <w:left w:val="single" w:sz="4" w:color="D9D9D9"/>
+              <w:bottom w:val="single" w:sz="4" w:color="D9D9D9"/>
+              <w:right w:val="single" w:sz="4" w:color="D9D9D9"/>
+            </w:tcBorders>
+          </w:tcPr>
+          <w:p>
+            <w:pPr>
+              <w:spacing w:after="40" w:before="40" w:line="240" w:lineRule="auto"/>
+            </w:pPr>
+            <w:r>
+              <w:rPr>
+                <w:rFonts w:ascii="Calibri" w:hAnsi="Calibri"/>
+                <w:b w:val="0"/>
+                <w:color w:val="000000"/>
+                <w:sz w:val="20"/>
+              </w:rPr>
+              <w:t>TC-003, TC-004</w:t>
             </w:r>
           </w:p>
         </w:tc>
@@ -4037,7 +4138,7 @@
         </w:trPr>
         <w:tc>
           <w:tcPr>
-            <w:tcW w:type="dxa" w:w="1728"/>
+            <w:tcW w:type="dxa" w:w="1800"/>
             <w:vAlign w:val="center"/>
             <w:tcMar>
               <w:top w:w="85" w:type="dxa"/>
@@ -4069,7 +4170,7 @@
         </w:tc>
         <w:tc>
           <w:tcPr>
-            <w:tcW w:type="dxa" w:w="2016"/>
+            <w:tcW w:type="dxa" w:w="2160"/>
             <w:vAlign w:val="center"/>
             <w:tcMar>
               <w:top w:w="85" w:type="dxa"/>
@@ -4101,33 +4202,33 @@
         </w:tc>
         <w:tc>
           <w:tcPr>
-            <w:tcW w:type="dxa" w:w="4896"/>
-            <w:vAlign w:val="center"/>
-            <w:tcMar>
-              <w:top w:w="85" w:type="dxa"/>
-              <w:left w:w="85" w:type="dxa"/>
-              <w:bottom w:w="85" w:type="dxa"/>
-              <w:right w:w="85" w:type="dxa"/>
-            </w:tcMar>
-            <w:tcBorders>
-              <w:top w:val="single" w:sz="4" w:color="D9D9D9"/>
-              <w:left w:val="single" w:sz="4" w:color="D9D9D9"/>
-              <w:bottom w:val="single" w:sz="4" w:color="D9D9D9"/>
-              <w:right w:val="single" w:sz="4" w:color="D9D9D9"/>
-            </w:tcBorders>
-          </w:tcPr>
-          <w:p>
-            <w:pPr>
-              <w:spacing w:after="40" w:before="40" w:line="240" w:lineRule="auto"/>
-            </w:pPr>
-            <w:r>
-              <w:rPr>
-                <w:rFonts w:ascii="Calibri" w:hAnsi="Calibri"/>
-                <w:b w:val="0"/>
-                <w:color w:val="000000"/>
-                <w:sz w:val="20"/>
-              </w:rPr>
-              <w:t>Document upload</w:t>
+            <w:tcW w:type="dxa" w:w="4680"/>
+            <w:vAlign w:val="center"/>
+            <w:tcMar>
+              <w:top w:w="85" w:type="dxa"/>
+              <w:left w:w="85" w:type="dxa"/>
+              <w:bottom w:w="85" w:type="dxa"/>
+              <w:right w:w="85" w:type="dxa"/>
+            </w:tcMar>
+            <w:tcBorders>
+              <w:top w:val="single" w:sz="4" w:color="D9D9D9"/>
+              <w:left w:val="single" w:sz="4" w:color="D9D9D9"/>
+              <w:bottom w:val="single" w:sz="4" w:color="D9D9D9"/>
+              <w:right w:val="single" w:sz="4" w:color="D9D9D9"/>
+            </w:tcBorders>
+          </w:tcPr>
+          <w:p>
+            <w:pPr>
+              <w:spacing w:after="40" w:before="40" w:line="240" w:lineRule="auto"/>
+            </w:pPr>
+            <w:r>
+              <w:rPr>
+                <w:rFonts w:ascii="Calibri" w:hAnsi="Calibri"/>
+                <w:b w:val="0"/>
+                <w:color w:val="000000"/>
+                <w:sz w:val="20"/>
+              </w:rPr>
+              <w:t>TC-005, TC-006</w:t>
             </w:r>
           </w:p>
         </w:tc>
@@ -4138,7 +4239,7 @@
         </w:trPr>
         <w:tc>
           <w:tcPr>
-            <w:tcW w:type="dxa" w:w="1728"/>
+            <w:tcW w:type="dxa" w:w="1800"/>
             <w:vAlign w:val="center"/>
             <w:tcMar>
               <w:top w:w="85" w:type="dxa"/>
@@ -4170,7 +4271,7 @@
         </w:tc>
         <w:tc>
           <w:tcPr>
-            <w:tcW w:type="dxa" w:w="2016"/>
+            <w:tcW w:type="dxa" w:w="2160"/>
             <w:vAlign w:val="center"/>
             <w:tcMar>
               <w:top w:w="85" w:type="dxa"/>
@@ -4202,33 +4303,33 @@
         </w:tc>
         <w:tc>
           <w:tcPr>
-            <w:tcW w:type="dxa" w:w="4896"/>
-            <w:vAlign w:val="center"/>
-            <w:tcMar>
-              <w:top w:w="85" w:type="dxa"/>
-              <w:left w:w="85" w:type="dxa"/>
-              <w:bottom w:w="85" w:type="dxa"/>
-              <w:right w:w="85" w:type="dxa"/>
-            </w:tcMar>
-            <w:tcBorders>
-              <w:top w:val="single" w:sz="4" w:color="D9D9D9"/>
-              <w:left w:val="single" w:sz="4" w:color="D9D9D9"/>
-              <w:bottom w:val="single" w:sz="4" w:color="D9D9D9"/>
-              <w:right w:val="single" w:sz="4" w:color="D9D9D9"/>
-            </w:tcBorders>
-          </w:tcPr>
-          <w:p>
-            <w:pPr>
-              <w:spacing w:after="40" w:before="40" w:line="240" w:lineRule="auto"/>
-            </w:pPr>
-            <w:r>
-              <w:rPr>
-                <w:rFonts w:ascii="Calibri" w:hAnsi="Calibri"/>
-                <w:b w:val="0"/>
-                <w:color w:val="000000"/>
-                <w:sz w:val="20"/>
-              </w:rPr>
-              <w:t>Document verification</w:t>
+            <w:tcW w:type="dxa" w:w="4680"/>
+            <w:vAlign w:val="center"/>
+            <w:tcMar>
+              <w:top w:w="85" w:type="dxa"/>
+              <w:left w:w="85" w:type="dxa"/>
+              <w:bottom w:w="85" w:type="dxa"/>
+              <w:right w:w="85" w:type="dxa"/>
+            </w:tcMar>
+            <w:tcBorders>
+              <w:top w:val="single" w:sz="4" w:color="D9D9D9"/>
+              <w:left w:val="single" w:sz="4" w:color="D9D9D9"/>
+              <w:bottom w:val="single" w:sz="4" w:color="D9D9D9"/>
+              <w:right w:val="single" w:sz="4" w:color="D9D9D9"/>
+            </w:tcBorders>
+          </w:tcPr>
+          <w:p>
+            <w:pPr>
+              <w:spacing w:after="40" w:before="40" w:line="240" w:lineRule="auto"/>
+            </w:pPr>
+            <w:r>
+              <w:rPr>
+                <w:rFonts w:ascii="Calibri" w:hAnsi="Calibri"/>
+                <w:b w:val="0"/>
+                <w:color w:val="000000"/>
+                <w:sz w:val="20"/>
+              </w:rPr>
+              <w:t>TC-007</w:t>
             </w:r>
           </w:p>
         </w:tc>
@@ -4239,7 +4340,7 @@
         </w:trPr>
         <w:tc>
           <w:tcPr>
-            <w:tcW w:type="dxa" w:w="1728"/>
+            <w:tcW w:type="dxa" w:w="1800"/>
             <w:vAlign w:val="center"/>
             <w:tcMar>
               <w:top w:w="85" w:type="dxa"/>
@@ -4271,7 +4372,7 @@
         </w:tc>
         <w:tc>
           <w:tcPr>
-            <w:tcW w:type="dxa" w:w="2016"/>
+            <w:tcW w:type="dxa" w:w="2160"/>
             <w:vAlign w:val="center"/>
             <w:tcMar>
               <w:top w:w="85" w:type="dxa"/>
@@ -4303,33 +4404,33 @@
         </w:tc>
         <w:tc>
           <w:tcPr>
-            <w:tcW w:type="dxa" w:w="4896"/>
-            <w:vAlign w:val="center"/>
-            <w:tcMar>
-              <w:top w:w="85" w:type="dxa"/>
-              <w:left w:w="85" w:type="dxa"/>
-              <w:bottom w:w="85" w:type="dxa"/>
-              <w:right w:w="85" w:type="dxa"/>
-            </w:tcMar>
-            <w:tcBorders>
-              <w:top w:val="single" w:sz="4" w:color="D9D9D9"/>
-              <w:left w:val="single" w:sz="4" w:color="D9D9D9"/>
-              <w:bottom w:val="single" w:sz="4" w:color="D9D9D9"/>
-              <w:right w:val="single" w:sz="4" w:color="D9D9D9"/>
-            </w:tcBorders>
-          </w:tcPr>
-          <w:p>
-            <w:pPr>
-              <w:spacing w:after="40" w:before="40" w:line="240" w:lineRule="auto"/>
-            </w:pPr>
-            <w:r>
-              <w:rPr>
-                <w:rFonts w:ascii="Calibri" w:hAnsi="Calibri"/>
-                <w:b w:val="0"/>
-                <w:color w:val="000000"/>
-                <w:sz w:val="20"/>
-              </w:rPr>
-              <w:t>Correction requests</w:t>
+            <w:tcW w:type="dxa" w:w="4680"/>
+            <w:vAlign w:val="center"/>
+            <w:tcMar>
+              <w:top w:w="85" w:type="dxa"/>
+              <w:left w:w="85" w:type="dxa"/>
+              <w:bottom w:w="85" w:type="dxa"/>
+              <w:right w:w="85" w:type="dxa"/>
+            </w:tcMar>
+            <w:tcBorders>
+              <w:top w:val="single" w:sz="4" w:color="D9D9D9"/>
+              <w:left w:val="single" w:sz="4" w:color="D9D9D9"/>
+              <w:bottom w:val="single" w:sz="4" w:color="D9D9D9"/>
+              <w:right w:val="single" w:sz="4" w:color="D9D9D9"/>
+            </w:tcBorders>
+          </w:tcPr>
+          <w:p>
+            <w:pPr>
+              <w:spacing w:after="40" w:before="40" w:line="240" w:lineRule="auto"/>
+            </w:pPr>
+            <w:r>
+              <w:rPr>
+                <w:rFonts w:ascii="Calibri" w:hAnsi="Calibri"/>
+                <w:b w:val="0"/>
+                <w:color w:val="000000"/>
+                <w:sz w:val="20"/>
+              </w:rPr>
+              <w:t>TC-008</w:t>
             </w:r>
           </w:p>
         </w:tc>
@@ -4340,7 +4441,7 @@
         </w:trPr>
         <w:tc>
           <w:tcPr>
-            <w:tcW w:type="dxa" w:w="1728"/>
+            <w:tcW w:type="dxa" w:w="1800"/>
             <w:vAlign w:val="center"/>
             <w:tcMar>
               <w:top w:w="85" w:type="dxa"/>
@@ -4372,7 +4473,7 @@
         </w:tc>
         <w:tc>
           <w:tcPr>
-            <w:tcW w:type="dxa" w:w="2016"/>
+            <w:tcW w:type="dxa" w:w="2160"/>
             <w:vAlign w:val="center"/>
             <w:tcMar>
               <w:top w:w="85" w:type="dxa"/>
@@ -4404,33 +4505,33 @@
         </w:tc>
         <w:tc>
           <w:tcPr>
-            <w:tcW w:type="dxa" w:w="4896"/>
-            <w:vAlign w:val="center"/>
-            <w:tcMar>
-              <w:top w:w="85" w:type="dxa"/>
-              <w:left w:w="85" w:type="dxa"/>
-              <w:bottom w:w="85" w:type="dxa"/>
-              <w:right w:w="85" w:type="dxa"/>
-            </w:tcMar>
-            <w:tcBorders>
-              <w:top w:val="single" w:sz="4" w:color="D9D9D9"/>
-              <w:left w:val="single" w:sz="4" w:color="D9D9D9"/>
-              <w:bottom w:val="single" w:sz="4" w:color="D9D9D9"/>
-              <w:right w:val="single" w:sz="4" w:color="D9D9D9"/>
-            </w:tcBorders>
-          </w:tcPr>
-          <w:p>
-            <w:pPr>
-              <w:spacing w:after="40" w:before="40" w:line="240" w:lineRule="auto"/>
-            </w:pPr>
-            <w:r>
-              <w:rPr>
-                <w:rFonts w:ascii="Calibri" w:hAnsi="Calibri"/>
-                <w:b w:val="0"/>
-                <w:color w:val="000000"/>
-                <w:sz w:val="20"/>
-              </w:rPr>
-              <w:t>Claim drafts</w:t>
+            <w:tcW w:type="dxa" w:w="4680"/>
+            <w:vAlign w:val="center"/>
+            <w:tcMar>
+              <w:top w:w="85" w:type="dxa"/>
+              <w:left w:w="85" w:type="dxa"/>
+              <w:bottom w:w="85" w:type="dxa"/>
+              <w:right w:w="85" w:type="dxa"/>
+            </w:tcMar>
+            <w:tcBorders>
+              <w:top w:val="single" w:sz="4" w:color="D9D9D9"/>
+              <w:left w:val="single" w:sz="4" w:color="D9D9D9"/>
+              <w:bottom w:val="single" w:sz="4" w:color="D9D9D9"/>
+              <w:right w:val="single" w:sz="4" w:color="D9D9D9"/>
+            </w:tcBorders>
+          </w:tcPr>
+          <w:p>
+            <w:pPr>
+              <w:spacing w:after="40" w:before="40" w:line="240" w:lineRule="auto"/>
+            </w:pPr>
+            <w:r>
+              <w:rPr>
+                <w:rFonts w:ascii="Calibri" w:hAnsi="Calibri"/>
+                <w:b w:val="0"/>
+                <w:color w:val="000000"/>
+                <w:sz w:val="20"/>
+              </w:rPr>
+              <w:t>TC-009</w:t>
             </w:r>
           </w:p>
         </w:tc>
@@ -4441,7 +4542,7 @@
         </w:trPr>
         <w:tc>
           <w:tcPr>
-            <w:tcW w:type="dxa" w:w="1728"/>
+            <w:tcW w:type="dxa" w:w="1800"/>
             <w:vAlign w:val="center"/>
             <w:tcMar>
               <w:top w:w="85" w:type="dxa"/>
@@ -4473,7 +4574,7 @@
         </w:tc>
         <w:tc>
           <w:tcPr>
-            <w:tcW w:type="dxa" w:w="2016"/>
+            <w:tcW w:type="dxa" w:w="2160"/>
             <w:vAlign w:val="center"/>
             <w:tcMar>
               <w:top w:w="85" w:type="dxa"/>
@@ -4505,33 +4606,33 @@
         </w:tc>
         <w:tc>
           <w:tcPr>
-            <w:tcW w:type="dxa" w:w="4896"/>
-            <w:vAlign w:val="center"/>
-            <w:tcMar>
-              <w:top w:w="85" w:type="dxa"/>
-              <w:left w:w="85" w:type="dxa"/>
-              <w:bottom w:w="85" w:type="dxa"/>
-              <w:right w:w="85" w:type="dxa"/>
-            </w:tcMar>
-            <w:tcBorders>
-              <w:top w:val="single" w:sz="4" w:color="D9D9D9"/>
-              <w:left w:val="single" w:sz="4" w:color="D9D9D9"/>
-              <w:bottom w:val="single" w:sz="4" w:color="D9D9D9"/>
-              <w:right w:val="single" w:sz="4" w:color="D9D9D9"/>
-            </w:tcBorders>
-          </w:tcPr>
-          <w:p>
-            <w:pPr>
-              <w:spacing w:after="40" w:before="40" w:line="240" w:lineRule="auto"/>
-            </w:pPr>
-            <w:r>
-              <w:rPr>
-                <w:rFonts w:ascii="Calibri" w:hAnsi="Calibri"/>
-                <w:b w:val="0"/>
-                <w:color w:val="000000"/>
-                <w:sz w:val="20"/>
-              </w:rPr>
-              <w:t>Claim submission</w:t>
+            <w:tcW w:type="dxa" w:w="4680"/>
+            <w:vAlign w:val="center"/>
+            <w:tcMar>
+              <w:top w:w="85" w:type="dxa"/>
+              <w:left w:w="85" w:type="dxa"/>
+              <w:bottom w:w="85" w:type="dxa"/>
+              <w:right w:w="85" w:type="dxa"/>
+            </w:tcMar>
+            <w:tcBorders>
+              <w:top w:val="single" w:sz="4" w:color="D9D9D9"/>
+              <w:left w:val="single" w:sz="4" w:color="D9D9D9"/>
+              <w:bottom w:val="single" w:sz="4" w:color="D9D9D9"/>
+              <w:right w:val="single" w:sz="4" w:color="D9D9D9"/>
+            </w:tcBorders>
+          </w:tcPr>
+          <w:p>
+            <w:pPr>
+              <w:spacing w:after="40" w:before="40" w:line="240" w:lineRule="auto"/>
+            </w:pPr>
+            <w:r>
+              <w:rPr>
+                <w:rFonts w:ascii="Calibri" w:hAnsi="Calibri"/>
+                <w:b w:val="0"/>
+                <w:color w:val="000000"/>
+                <w:sz w:val="20"/>
+              </w:rPr>
+              <w:t>TC-010, TC-011</w:t>
             </w:r>
           </w:p>
         </w:tc>
@@ -4542,7 +4643,7 @@
         </w:trPr>
         <w:tc>
           <w:tcPr>
-            <w:tcW w:type="dxa" w:w="1728"/>
+            <w:tcW w:type="dxa" w:w="1800"/>
             <w:vAlign w:val="center"/>
             <w:tcMar>
               <w:top w:w="85" w:type="dxa"/>
@@ -4574,7 +4675,7 @@
         </w:tc>
         <w:tc>
           <w:tcPr>
-            <w:tcW w:type="dxa" w:w="2016"/>
+            <w:tcW w:type="dxa" w:w="2160"/>
             <w:vAlign w:val="center"/>
             <w:tcMar>
               <w:top w:w="85" w:type="dxa"/>
@@ -4606,33 +4707,33 @@
         </w:tc>
         <w:tc>
           <w:tcPr>
-            <w:tcW w:type="dxa" w:w="4896"/>
-            <w:vAlign w:val="center"/>
-            <w:tcMar>
-              <w:top w:w="85" w:type="dxa"/>
-              <w:left w:w="85" w:type="dxa"/>
-              <w:bottom w:w="85" w:type="dxa"/>
-              <w:right w:w="85" w:type="dxa"/>
-            </w:tcMar>
-            <w:tcBorders>
-              <w:top w:val="single" w:sz="4" w:color="D9D9D9"/>
-              <w:left w:val="single" w:sz="4" w:color="D9D9D9"/>
-              <w:bottom w:val="single" w:sz="4" w:color="D9D9D9"/>
-              <w:right w:val="single" w:sz="4" w:color="D9D9D9"/>
-            </w:tcBorders>
-          </w:tcPr>
-          <w:p>
-            <w:pPr>
-              <w:spacing w:after="40" w:before="40" w:line="240" w:lineRule="auto"/>
-            </w:pPr>
-            <w:r>
-              <w:rPr>
-                <w:rFonts w:ascii="Calibri" w:hAnsi="Calibri"/>
-                <w:b w:val="0"/>
-                <w:color w:val="000000"/>
-                <w:sz w:val="20"/>
-              </w:rPr>
-              <w:t>Work assignment</w:t>
+            <w:tcW w:type="dxa" w:w="4680"/>
+            <w:vAlign w:val="center"/>
+            <w:tcMar>
+              <w:top w:w="85" w:type="dxa"/>
+              <w:left w:w="85" w:type="dxa"/>
+              <w:bottom w:w="85" w:type="dxa"/>
+              <w:right w:w="85" w:type="dxa"/>
+            </w:tcMar>
+            <w:tcBorders>
+              <w:top w:val="single" w:sz="4" w:color="D9D9D9"/>
+              <w:left w:val="single" w:sz="4" w:color="D9D9D9"/>
+              <w:bottom w:val="single" w:sz="4" w:color="D9D9D9"/>
+              <w:right w:val="single" w:sz="4" w:color="D9D9D9"/>
+            </w:tcBorders>
+          </w:tcPr>
+          <w:p>
+            <w:pPr>
+              <w:spacing w:after="40" w:before="40" w:line="240" w:lineRule="auto"/>
+            </w:pPr>
+            <w:r>
+              <w:rPr>
+                <w:rFonts w:ascii="Calibri" w:hAnsi="Calibri"/>
+                <w:b w:val="0"/>
+                <w:color w:val="000000"/>
+                <w:sz w:val="20"/>
+              </w:rPr>
+              <w:t>TC-012</w:t>
             </w:r>
           </w:p>
         </w:tc>
@@ -4643,7 +4744,7 @@
         </w:trPr>
         <w:tc>
           <w:tcPr>
-            <w:tcW w:type="dxa" w:w="1728"/>
+            <w:tcW w:type="dxa" w:w="1800"/>
             <w:vAlign w:val="center"/>
             <w:tcMar>
               <w:top w:w="85" w:type="dxa"/>
@@ -4675,7 +4776,7 @@
         </w:tc>
         <w:tc>
           <w:tcPr>
-            <w:tcW w:type="dxa" w:w="2016"/>
+            <w:tcW w:type="dxa" w:w="2160"/>
             <w:vAlign w:val="center"/>
             <w:tcMar>
               <w:top w:w="85" w:type="dxa"/>
@@ -4707,33 +4808,33 @@
         </w:tc>
         <w:tc>
           <w:tcPr>
-            <w:tcW w:type="dxa" w:w="4896"/>
-            <w:vAlign w:val="center"/>
-            <w:tcMar>
-              <w:top w:w="85" w:type="dxa"/>
-              <w:left w:w="85" w:type="dxa"/>
-              <w:bottom w:w="85" w:type="dxa"/>
-              <w:right w:w="85" w:type="dxa"/>
-            </w:tcMar>
-            <w:tcBorders>
-              <w:top w:val="single" w:sz="4" w:color="D9D9D9"/>
-              <w:left w:val="single" w:sz="4" w:color="D9D9D9"/>
-              <w:bottom w:val="single" w:sz="4" w:color="D9D9D9"/>
-              <w:right w:val="single" w:sz="4" w:color="D9D9D9"/>
-            </w:tcBorders>
-          </w:tcPr>
-          <w:p>
-            <w:pPr>
-              <w:spacing w:after="40" w:before="40" w:line="240" w:lineRule="auto"/>
-            </w:pPr>
-            <w:r>
-              <w:rPr>
-                <w:rFonts w:ascii="Calibri" w:hAnsi="Calibri"/>
-                <w:b w:val="0"/>
-                <w:color w:val="000000"/>
-                <w:sz w:val="20"/>
-              </w:rPr>
-              <w:t>Application processing</w:t>
+            <w:tcW w:type="dxa" w:w="4680"/>
+            <w:vAlign w:val="center"/>
+            <w:tcMar>
+              <w:top w:w="85" w:type="dxa"/>
+              <w:left w:w="85" w:type="dxa"/>
+              <w:bottom w:w="85" w:type="dxa"/>
+              <w:right w:w="85" w:type="dxa"/>
+            </w:tcMar>
+            <w:tcBorders>
+              <w:top w:val="single" w:sz="4" w:color="D9D9D9"/>
+              <w:left w:val="single" w:sz="4" w:color="D9D9D9"/>
+              <w:bottom w:val="single" w:sz="4" w:color="D9D9D9"/>
+              <w:right w:val="single" w:sz="4" w:color="D9D9D9"/>
+            </w:tcBorders>
+          </w:tcPr>
+          <w:p>
+            <w:pPr>
+              <w:spacing w:after="40" w:before="40" w:line="240" w:lineRule="auto"/>
+            </w:pPr>
+            <w:r>
+              <w:rPr>
+                <w:rFonts w:ascii="Calibri" w:hAnsi="Calibri"/>
+                <w:b w:val="0"/>
+                <w:color w:val="000000"/>
+                <w:sz w:val="20"/>
+              </w:rPr>
+              <w:t>TC-013</w:t>
             </w:r>
           </w:p>
         </w:tc>
@@ -4744,7 +4845,7 @@
         </w:trPr>
         <w:tc>
           <w:tcPr>
-            <w:tcW w:type="dxa" w:w="1728"/>
+            <w:tcW w:type="dxa" w:w="1800"/>
             <w:vAlign w:val="center"/>
             <w:tcMar>
               <w:top w:w="85" w:type="dxa"/>
@@ -4776,7 +4877,7 @@
         </w:tc>
         <w:tc>
           <w:tcPr>
-            <w:tcW w:type="dxa" w:w="2016"/>
+            <w:tcW w:type="dxa" w:w="2160"/>
             <w:vAlign w:val="center"/>
             <w:tcMar>
               <w:top w:w="85" w:type="dxa"/>
@@ -4808,33 +4909,33 @@
         </w:tc>
         <w:tc>
           <w:tcPr>
-            <w:tcW w:type="dxa" w:w="4896"/>
-            <w:vAlign w:val="center"/>
-            <w:tcMar>
-              <w:top w:w="85" w:type="dxa"/>
-              <w:left w:w="85" w:type="dxa"/>
-              <w:bottom w:w="85" w:type="dxa"/>
-              <w:right w:w="85" w:type="dxa"/>
-            </w:tcMar>
-            <w:tcBorders>
-              <w:top w:val="single" w:sz="4" w:color="D9D9D9"/>
-              <w:left w:val="single" w:sz="4" w:color="D9D9D9"/>
-              <w:bottom w:val="single" w:sz="4" w:color="D9D9D9"/>
-              <w:right w:val="single" w:sz="4" w:color="D9D9D9"/>
-            </w:tcBorders>
-          </w:tcPr>
-          <w:p>
-            <w:pPr>
-              <w:spacing w:after="40" w:before="40" w:line="240" w:lineRule="auto"/>
-            </w:pPr>
-            <w:r>
-              <w:rPr>
-                <w:rFonts w:ascii="Calibri" w:hAnsi="Calibri"/>
-                <w:b w:val="0"/>
-                <w:color w:val="000000"/>
-                <w:sz w:val="20"/>
-              </w:rPr>
-              <w:t>Claim processing</w:t>
+            <w:tcW w:type="dxa" w:w="4680"/>
+            <w:vAlign w:val="center"/>
+            <w:tcMar>
+              <w:top w:w="85" w:type="dxa"/>
+              <w:left w:w="85" w:type="dxa"/>
+              <w:bottom w:w="85" w:type="dxa"/>
+              <w:right w:w="85" w:type="dxa"/>
+            </w:tcMar>
+            <w:tcBorders>
+              <w:top w:val="single" w:sz="4" w:color="D9D9D9"/>
+              <w:left w:val="single" w:sz="4" w:color="D9D9D9"/>
+              <w:bottom w:val="single" w:sz="4" w:color="D9D9D9"/>
+              <w:right w:val="single" w:sz="4" w:color="D9D9D9"/>
+            </w:tcBorders>
+          </w:tcPr>
+          <w:p>
+            <w:pPr>
+              <w:spacing w:after="40" w:before="40" w:line="240" w:lineRule="auto"/>
+            </w:pPr>
+            <w:r>
+              <w:rPr>
+                <w:rFonts w:ascii="Calibri" w:hAnsi="Calibri"/>
+                <w:b w:val="0"/>
+                <w:color w:val="000000"/>
+                <w:sz w:val="20"/>
+              </w:rPr>
+              <w:t>TC-014</w:t>
             </w:r>
           </w:p>
         </w:tc>
@@ -4845,7 +4946,7 @@
         </w:trPr>
         <w:tc>
           <w:tcPr>
-            <w:tcW w:type="dxa" w:w="1728"/>
+            <w:tcW w:type="dxa" w:w="1800"/>
             <w:vAlign w:val="center"/>
             <w:tcMar>
               <w:top w:w="85" w:type="dxa"/>
@@ -4877,7 +4978,7 @@
         </w:tc>
         <w:tc>
           <w:tcPr>
-            <w:tcW w:type="dxa" w:w="2016"/>
+            <w:tcW w:type="dxa" w:w="2160"/>
             <w:vAlign w:val="center"/>
             <w:tcMar>
               <w:top w:w="85" w:type="dxa"/>
@@ -4909,33 +5010,33 @@
         </w:tc>
         <w:tc>
           <w:tcPr>
-            <w:tcW w:type="dxa" w:w="4896"/>
-            <w:vAlign w:val="center"/>
-            <w:tcMar>
-              <w:top w:w="85" w:type="dxa"/>
-              <w:left w:w="85" w:type="dxa"/>
-              <w:bottom w:w="85" w:type="dxa"/>
-              <w:right w:w="85" w:type="dxa"/>
-            </w:tcMar>
-            <w:tcBorders>
-              <w:top w:val="single" w:sz="4" w:color="D9D9D9"/>
-              <w:left w:val="single" w:sz="4" w:color="D9D9D9"/>
-              <w:bottom w:val="single" w:sz="4" w:color="D9D9D9"/>
-              <w:right w:val="single" w:sz="4" w:color="D9D9D9"/>
-            </w:tcBorders>
-          </w:tcPr>
-          <w:p>
-            <w:pPr>
-              <w:spacing w:after="40" w:before="40" w:line="240" w:lineRule="auto"/>
-            </w:pPr>
-            <w:r>
-              <w:rPr>
-                <w:rFonts w:ascii="Calibri" w:hAnsi="Calibri"/>
-                <w:b w:val="0"/>
-                <w:color w:val="000000"/>
-                <w:sz w:val="20"/>
-              </w:rPr>
-              <w:t>Decisions</w:t>
+            <w:tcW w:type="dxa" w:w="4680"/>
+            <w:vAlign w:val="center"/>
+            <w:tcMar>
+              <w:top w:w="85" w:type="dxa"/>
+              <w:left w:w="85" w:type="dxa"/>
+              <w:bottom w:w="85" w:type="dxa"/>
+              <w:right w:w="85" w:type="dxa"/>
+            </w:tcMar>
+            <w:tcBorders>
+              <w:top w:val="single" w:sz="4" w:color="D9D9D9"/>
+              <w:left w:val="single" w:sz="4" w:color="D9D9D9"/>
+              <w:bottom w:val="single" w:sz="4" w:color="D9D9D9"/>
+              <w:right w:val="single" w:sz="4" w:color="D9D9D9"/>
+            </w:tcBorders>
+          </w:tcPr>
+          <w:p>
+            <w:pPr>
+              <w:spacing w:after="40" w:before="40" w:line="240" w:lineRule="auto"/>
+            </w:pPr>
+            <w:r>
+              <w:rPr>
+                <w:rFonts w:ascii="Calibri" w:hAnsi="Calibri"/>
+                <w:b w:val="0"/>
+                <w:color w:val="000000"/>
+                <w:sz w:val="20"/>
+              </w:rPr>
+              <w:t>TC-015, TC-016</w:t>
             </w:r>
           </w:p>
         </w:tc>
@@ -4946,7 +5047,7 @@
         </w:trPr>
         <w:tc>
           <w:tcPr>
-            <w:tcW w:type="dxa" w:w="1728"/>
+            <w:tcW w:type="dxa" w:w="1800"/>
             <w:vAlign w:val="center"/>
             <w:tcMar>
               <w:top w:w="85" w:type="dxa"/>
@@ -4978,7 +5079,7 @@
         </w:tc>
         <w:tc>
           <w:tcPr>
-            <w:tcW w:type="dxa" w:w="2016"/>
+            <w:tcW w:type="dxa" w:w="2160"/>
             <w:vAlign w:val="center"/>
             <w:tcMar>
               <w:top w:w="85" w:type="dxa"/>
@@ -5010,33 +5111,33 @@
         </w:tc>
         <w:tc>
           <w:tcPr>
-            <w:tcW w:type="dxa" w:w="4896"/>
-            <w:vAlign w:val="center"/>
-            <w:tcMar>
-              <w:top w:w="85" w:type="dxa"/>
-              <w:left w:w="85" w:type="dxa"/>
-              <w:bottom w:w="85" w:type="dxa"/>
-              <w:right w:w="85" w:type="dxa"/>
-            </w:tcMar>
-            <w:tcBorders>
-              <w:top w:val="single" w:sz="4" w:color="D9D9D9"/>
-              <w:left w:val="single" w:sz="4" w:color="D9D9D9"/>
-              <w:bottom w:val="single" w:sz="4" w:color="D9D9D9"/>
-              <w:right w:val="single" w:sz="4" w:color="D9D9D9"/>
-            </w:tcBorders>
-          </w:tcPr>
-          <w:p>
-            <w:pPr>
-              <w:spacing w:after="40" w:before="40" w:line="240" w:lineRule="auto"/>
-            </w:pPr>
-            <w:r>
-              <w:rPr>
-                <w:rFonts w:ascii="Calibri" w:hAnsi="Calibri"/>
-                <w:b w:val="0"/>
-                <w:color w:val="000000"/>
-                <w:sz w:val="20"/>
-              </w:rPr>
-              <w:t>Status and history</w:t>
+            <w:tcW w:type="dxa" w:w="4680"/>
+            <w:vAlign w:val="center"/>
+            <w:tcMar>
+              <w:top w:w="85" w:type="dxa"/>
+              <w:left w:w="85" w:type="dxa"/>
+              <w:bottom w:w="85" w:type="dxa"/>
+              <w:right w:w="85" w:type="dxa"/>
+            </w:tcMar>
+            <w:tcBorders>
+              <w:top w:val="single" w:sz="4" w:color="D9D9D9"/>
+              <w:left w:val="single" w:sz="4" w:color="D9D9D9"/>
+              <w:bottom w:val="single" w:sz="4" w:color="D9D9D9"/>
+              <w:right w:val="single" w:sz="4" w:color="D9D9D9"/>
+            </w:tcBorders>
+          </w:tcPr>
+          <w:p>
+            <w:pPr>
+              <w:spacing w:after="40" w:before="40" w:line="240" w:lineRule="auto"/>
+            </w:pPr>
+            <w:r>
+              <w:rPr>
+                <w:rFonts w:ascii="Calibri" w:hAnsi="Calibri"/>
+                <w:b w:val="0"/>
+                <w:color w:val="000000"/>
+                <w:sz w:val="20"/>
+              </w:rPr>
+              <w:t>TC-017</w:t>
             </w:r>
           </w:p>
         </w:tc>
@@ -5047,7 +5148,7 @@
         </w:trPr>
         <w:tc>
           <w:tcPr>
-            <w:tcW w:type="dxa" w:w="1728"/>
+            <w:tcW w:type="dxa" w:w="1800"/>
             <w:vAlign w:val="center"/>
             <w:tcMar>
               <w:top w:w="85" w:type="dxa"/>
@@ -5079,7 +5180,7 @@
         </w:tc>
         <w:tc>
           <w:tcPr>
-            <w:tcW w:type="dxa" w:w="2016"/>
+            <w:tcW w:type="dxa" w:w="2160"/>
             <w:vAlign w:val="center"/>
             <w:tcMar>
               <w:top w:w="85" w:type="dxa"/>
@@ -5111,33 +5212,33 @@
         </w:tc>
         <w:tc>
           <w:tcPr>
-            <w:tcW w:type="dxa" w:w="4896"/>
-            <w:vAlign w:val="center"/>
-            <w:tcMar>
-              <w:top w:w="85" w:type="dxa"/>
-              <w:left w:w="85" w:type="dxa"/>
-              <w:bottom w:w="85" w:type="dxa"/>
-              <w:right w:w="85" w:type="dxa"/>
-            </w:tcMar>
-            <w:tcBorders>
-              <w:top w:val="single" w:sz="4" w:color="D9D9D9"/>
-              <w:left w:val="single" w:sz="4" w:color="D9D9D9"/>
-              <w:bottom w:val="single" w:sz="4" w:color="D9D9D9"/>
-              <w:right w:val="single" w:sz="4" w:color="D9D9D9"/>
-            </w:tcBorders>
-          </w:tcPr>
-          <w:p>
-            <w:pPr>
-              <w:spacing w:after="40" w:before="40" w:line="240" w:lineRule="auto"/>
-            </w:pPr>
-            <w:r>
-              <w:rPr>
-                <w:rFonts w:ascii="Calibri" w:hAnsi="Calibri"/>
-                <w:b w:val="0"/>
-                <w:color w:val="000000"/>
-                <w:sz w:val="20"/>
-              </w:rPr>
-              <w:t>Notifications</w:t>
+            <w:tcW w:type="dxa" w:w="4680"/>
+            <w:vAlign w:val="center"/>
+            <w:tcMar>
+              <w:top w:w="85" w:type="dxa"/>
+              <w:left w:w="85" w:type="dxa"/>
+              <w:bottom w:w="85" w:type="dxa"/>
+              <w:right w:w="85" w:type="dxa"/>
+            </w:tcMar>
+            <w:tcBorders>
+              <w:top w:val="single" w:sz="4" w:color="D9D9D9"/>
+              <w:left w:val="single" w:sz="4" w:color="D9D9D9"/>
+              <w:bottom w:val="single" w:sz="4" w:color="D9D9D9"/>
+              <w:right w:val="single" w:sz="4" w:color="D9D9D9"/>
+            </w:tcBorders>
+          </w:tcPr>
+          <w:p>
+            <w:pPr>
+              <w:spacing w:after="40" w:before="40" w:line="240" w:lineRule="auto"/>
+            </w:pPr>
+            <w:r>
+              <w:rPr>
+                <w:rFonts w:ascii="Calibri" w:hAnsi="Calibri"/>
+                <w:b w:val="0"/>
+                <w:color w:val="000000"/>
+                <w:sz w:val="20"/>
+              </w:rPr>
+              <w:t>TC-018, TC-019</w:t>
             </w:r>
           </w:p>
         </w:tc>
@@ -5148,7 +5249,7 @@
         </w:trPr>
         <w:tc>
           <w:tcPr>
-            <w:tcW w:type="dxa" w:w="1728"/>
+            <w:tcW w:type="dxa" w:w="1800"/>
             <w:vAlign w:val="center"/>
             <w:tcMar>
               <w:top w:w="85" w:type="dxa"/>
@@ -5180,7 +5281,7 @@
         </w:tc>
         <w:tc>
           <w:tcPr>
-            <w:tcW w:type="dxa" w:w="2016"/>
+            <w:tcW w:type="dxa" w:w="2160"/>
             <w:vAlign w:val="center"/>
             <w:tcMar>
               <w:top w:w="85" w:type="dxa"/>
@@ -5212,33 +5313,33 @@
         </w:tc>
         <w:tc>
           <w:tcPr>
-            <w:tcW w:type="dxa" w:w="4896"/>
-            <w:vAlign w:val="center"/>
-            <w:tcMar>
-              <w:top w:w="85" w:type="dxa"/>
-              <w:left w:w="85" w:type="dxa"/>
-              <w:bottom w:w="85" w:type="dxa"/>
-              <w:right w:w="85" w:type="dxa"/>
-            </w:tcMar>
-            <w:tcBorders>
-              <w:top w:val="single" w:sz="4" w:color="D9D9D9"/>
-              <w:left w:val="single" w:sz="4" w:color="D9D9D9"/>
-              <w:bottom w:val="single" w:sz="4" w:color="D9D9D9"/>
-              <w:right w:val="single" w:sz="4" w:color="D9D9D9"/>
-            </w:tcBorders>
-          </w:tcPr>
-          <w:p>
-            <w:pPr>
-              <w:spacing w:after="40" w:before="40" w:line="240" w:lineRule="auto"/>
-            </w:pPr>
-            <w:r>
-              <w:rPr>
-                <w:rFonts w:ascii="Calibri" w:hAnsi="Calibri"/>
-                <w:b w:val="0"/>
-                <w:color w:val="000000"/>
-                <w:sz w:val="20"/>
-              </w:rPr>
-              <w:t>Audit trail</w:t>
+            <w:tcW w:type="dxa" w:w="4680"/>
+            <w:vAlign w:val="center"/>
+            <w:tcMar>
+              <w:top w:w="85" w:type="dxa"/>
+              <w:left w:w="85" w:type="dxa"/>
+              <w:bottom w:w="85" w:type="dxa"/>
+              <w:right w:w="85" w:type="dxa"/>
+            </w:tcMar>
+            <w:tcBorders>
+              <w:top w:val="single" w:sz="4" w:color="D9D9D9"/>
+              <w:left w:val="single" w:sz="4" w:color="D9D9D9"/>
+              <w:bottom w:val="single" w:sz="4" w:color="D9D9D9"/>
+              <w:right w:val="single" w:sz="4" w:color="D9D9D9"/>
+            </w:tcBorders>
+          </w:tcPr>
+          <w:p>
+            <w:pPr>
+              <w:spacing w:after="40" w:before="40" w:line="240" w:lineRule="auto"/>
+            </w:pPr>
+            <w:r>
+              <w:rPr>
+                <w:rFonts w:ascii="Calibri" w:hAnsi="Calibri"/>
+                <w:b w:val="0"/>
+                <w:color w:val="000000"/>
+                <w:sz w:val="20"/>
+              </w:rPr>
+              <w:t>TC-020</w:t>
             </w:r>
           </w:p>
         </w:tc>
@@ -5249,7 +5350,7 @@
         </w:trPr>
         <w:tc>
           <w:tcPr>
-            <w:tcW w:type="dxa" w:w="1728"/>
+            <w:tcW w:type="dxa" w:w="1800"/>
             <w:vAlign w:val="center"/>
             <w:tcMar>
               <w:top w:w="85" w:type="dxa"/>
@@ -5281,7 +5382,7 @@
         </w:tc>
         <w:tc>
           <w:tcPr>
-            <w:tcW w:type="dxa" w:w="2016"/>
+            <w:tcW w:type="dxa" w:w="2160"/>
             <w:vAlign w:val="center"/>
             <w:tcMar>
               <w:top w:w="85" w:type="dxa"/>
@@ -5313,33 +5414,33 @@
         </w:tc>
         <w:tc>
           <w:tcPr>
-            <w:tcW w:type="dxa" w:w="4896"/>
-            <w:vAlign w:val="center"/>
-            <w:tcMar>
-              <w:top w:w="85" w:type="dxa"/>
-              <w:left w:w="85" w:type="dxa"/>
-              <w:bottom w:w="85" w:type="dxa"/>
-              <w:right w:w="85" w:type="dxa"/>
-            </w:tcMar>
-            <w:tcBorders>
-              <w:top w:val="single" w:sz="4" w:color="D9D9D9"/>
-              <w:left w:val="single" w:sz="4" w:color="D9D9D9"/>
-              <w:bottom w:val="single" w:sz="4" w:color="D9D9D9"/>
-              <w:right w:val="single" w:sz="4" w:color="D9D9D9"/>
-            </w:tcBorders>
-          </w:tcPr>
-          <w:p>
-            <w:pPr>
-              <w:spacing w:after="40" w:before="40" w:line="240" w:lineRule="auto"/>
-            </w:pPr>
-            <w:r>
-              <w:rPr>
-                <w:rFonts w:ascii="Calibri" w:hAnsi="Calibri"/>
-                <w:b w:val="0"/>
-                <w:color w:val="000000"/>
-                <w:sz w:val="20"/>
-              </w:rPr>
-              <w:t>Role administration</w:t>
+            <w:tcW w:type="dxa" w:w="4680"/>
+            <w:vAlign w:val="center"/>
+            <w:tcMar>
+              <w:top w:w="85" w:type="dxa"/>
+              <w:left w:w="85" w:type="dxa"/>
+              <w:bottom w:w="85" w:type="dxa"/>
+              <w:right w:w="85" w:type="dxa"/>
+            </w:tcMar>
+            <w:tcBorders>
+              <w:top w:val="single" w:sz="4" w:color="D9D9D9"/>
+              <w:left w:val="single" w:sz="4" w:color="D9D9D9"/>
+              <w:bottom w:val="single" w:sz="4" w:color="D9D9D9"/>
+              <w:right w:val="single" w:sz="4" w:color="D9D9D9"/>
+            </w:tcBorders>
+          </w:tcPr>
+          <w:p>
+            <w:pPr>
+              <w:spacing w:after="40" w:before="40" w:line="240" w:lineRule="auto"/>
+            </w:pPr>
+            <w:r>
+              <w:rPr>
+                <w:rFonts w:ascii="Calibri" w:hAnsi="Calibri"/>
+                <w:b w:val="0"/>
+                <w:color w:val="000000"/>
+                <w:sz w:val="20"/>
+              </w:rPr>
+              <w:t>TC-021</w:t>
             </w:r>
           </w:p>
         </w:tc>
@@ -5350,7 +5451,7 @@
         </w:trPr>
         <w:tc>
           <w:tcPr>
-            <w:tcW w:type="dxa" w:w="1728"/>
+            <w:tcW w:type="dxa" w:w="1800"/>
             <w:vAlign w:val="center"/>
             <w:tcMar>
               <w:top w:w="85" w:type="dxa"/>
@@ -5382,7 +5483,7 @@
         </w:tc>
         <w:tc>
           <w:tcPr>
-            <w:tcW w:type="dxa" w:w="2016"/>
+            <w:tcW w:type="dxa" w:w="2160"/>
             <w:vAlign w:val="center"/>
             <w:tcMar>
               <w:top w:w="85" w:type="dxa"/>
@@ -5414,33 +5515,33 @@
         </w:tc>
         <w:tc>
           <w:tcPr>
-            <w:tcW w:type="dxa" w:w="4896"/>
-            <w:vAlign w:val="center"/>
-            <w:tcMar>
-              <w:top w:w="85" w:type="dxa"/>
-              <w:left w:w="85" w:type="dxa"/>
-              <w:bottom w:w="85" w:type="dxa"/>
-              <w:right w:w="85" w:type="dxa"/>
-            </w:tcMar>
-            <w:tcBorders>
-              <w:top w:val="single" w:sz="4" w:color="D9D9D9"/>
-              <w:left w:val="single" w:sz="4" w:color="D9D9D9"/>
-              <w:bottom w:val="single" w:sz="4" w:color="D9D9D9"/>
-              <w:right w:val="single" w:sz="4" w:color="D9D9D9"/>
-            </w:tcBorders>
-          </w:tcPr>
-          <w:p>
-            <w:pPr>
-              <w:spacing w:after="40" w:before="40" w:line="240" w:lineRule="auto"/>
-            </w:pPr>
-            <w:r>
-              <w:rPr>
-                <w:rFonts w:ascii="Calibri" w:hAnsi="Calibri"/>
-                <w:b w:val="0"/>
-                <w:color w:val="000000"/>
-                <w:sz w:val="20"/>
-              </w:rPr>
-              <w:t>Queues and search</w:t>
+            <w:tcW w:type="dxa" w:w="4680"/>
+            <w:vAlign w:val="center"/>
+            <w:tcMar>
+              <w:top w:w="85" w:type="dxa"/>
+              <w:left w:w="85" w:type="dxa"/>
+              <w:bottom w:w="85" w:type="dxa"/>
+              <w:right w:w="85" w:type="dxa"/>
+            </w:tcMar>
+            <w:tcBorders>
+              <w:top w:val="single" w:sz="4" w:color="D9D9D9"/>
+              <w:left w:val="single" w:sz="4" w:color="D9D9D9"/>
+              <w:bottom w:val="single" w:sz="4" w:color="D9D9D9"/>
+              <w:right w:val="single" w:sz="4" w:color="D9D9D9"/>
+            </w:tcBorders>
+          </w:tcPr>
+          <w:p>
+            <w:pPr>
+              <w:spacing w:after="40" w:before="40" w:line="240" w:lineRule="auto"/>
+            </w:pPr>
+            <w:r>
+              <w:rPr>
+                <w:rFonts w:ascii="Calibri" w:hAnsi="Calibri"/>
+                <w:b w:val="0"/>
+                <w:color w:val="000000"/>
+                <w:sz w:val="20"/>
+              </w:rPr>
+              <w:t>TC-022</w:t>
             </w:r>
           </w:p>
         </w:tc>
@@ -5451,7 +5552,7 @@
         </w:trPr>
         <w:tc>
           <w:tcPr>
-            <w:tcW w:type="dxa" w:w="1728"/>
+            <w:tcW w:type="dxa" w:w="1800"/>
             <w:vAlign w:val="center"/>
             <w:tcMar>
               <w:top w:w="85" w:type="dxa"/>
@@ -5483,7 +5584,7 @@
         </w:tc>
         <w:tc>
           <w:tcPr>
-            <w:tcW w:type="dxa" w:w="2016"/>
+            <w:tcW w:type="dxa" w:w="2160"/>
             <w:vAlign w:val="center"/>
             <w:tcMar>
               <w:top w:w="85" w:type="dxa"/>
@@ -5515,33 +5616,33 @@
         </w:tc>
         <w:tc>
           <w:tcPr>
-            <w:tcW w:type="dxa" w:w="4896"/>
-            <w:vAlign w:val="center"/>
-            <w:tcMar>
-              <w:top w:w="85" w:type="dxa"/>
-              <w:left w:w="85" w:type="dxa"/>
-              <w:bottom w:w="85" w:type="dxa"/>
-              <w:right w:w="85" w:type="dxa"/>
-            </w:tcMar>
-            <w:tcBorders>
-              <w:top w:val="single" w:sz="4" w:color="D9D9D9"/>
-              <w:left w:val="single" w:sz="4" w:color="D9D9D9"/>
-              <w:bottom w:val="single" w:sz="4" w:color="D9D9D9"/>
-              <w:right w:val="single" w:sz="4" w:color="D9D9D9"/>
-            </w:tcBorders>
-          </w:tcPr>
-          <w:p>
-            <w:pPr>
-              <w:spacing w:after="40" w:before="40" w:line="240" w:lineRule="auto"/>
-            </w:pPr>
-            <w:r>
-              <w:rPr>
-                <w:rFonts w:ascii="Calibri" w:hAnsi="Calibri"/>
-                <w:b w:val="0"/>
-                <w:color w:val="000000"/>
-                <w:sz w:val="20"/>
-              </w:rPr>
-              <w:t>Concurrency and retries</w:t>
+            <w:tcW w:type="dxa" w:w="4680"/>
+            <w:vAlign w:val="center"/>
+            <w:tcMar>
+              <w:top w:w="85" w:type="dxa"/>
+              <w:left w:w="85" w:type="dxa"/>
+              <w:bottom w:w="85" w:type="dxa"/>
+              <w:right w:w="85" w:type="dxa"/>
+            </w:tcMar>
+            <w:tcBorders>
+              <w:top w:val="single" w:sz="4" w:color="D9D9D9"/>
+              <w:left w:val="single" w:sz="4" w:color="D9D9D9"/>
+              <w:bottom w:val="single" w:sz="4" w:color="D9D9D9"/>
+              <w:right w:val="single" w:sz="4" w:color="D9D9D9"/>
+            </w:tcBorders>
+          </w:tcPr>
+          <w:p>
+            <w:pPr>
+              <w:spacing w:after="40" w:before="40" w:line="240" w:lineRule="auto"/>
+            </w:pPr>
+            <w:r>
+              <w:rPr>
+                <w:rFonts w:ascii="Calibri" w:hAnsi="Calibri"/>
+                <w:b w:val="0"/>
+                <w:color w:val="000000"/>
+                <w:sz w:val="20"/>
+              </w:rPr>
+              <w:t>TC-023, TC-024</w:t>
             </w:r>
           </w:p>
         </w:tc>
@@ -5552,7 +5653,7 @@
         </w:trPr>
         <w:tc>
           <w:tcPr>
-            <w:tcW w:type="dxa" w:w="1728"/>
+            <w:tcW w:type="dxa" w:w="1800"/>
             <w:vAlign w:val="center"/>
             <w:tcMar>
               <w:top w:w="85" w:type="dxa"/>
@@ -5584,7 +5685,7 @@
         </w:tc>
         <w:tc>
           <w:tcPr>
-            <w:tcW w:type="dxa" w:w="2016"/>
+            <w:tcW w:type="dxa" w:w="2160"/>
             <w:vAlign w:val="center"/>
             <w:tcMar>
               <w:top w:w="85" w:type="dxa"/>
@@ -5616,33 +5717,33 @@
         </w:tc>
         <w:tc>
           <w:tcPr>
-            <w:tcW w:type="dxa" w:w="4896"/>
-            <w:vAlign w:val="center"/>
-            <w:tcMar>
-              <w:top w:w="85" w:type="dxa"/>
-              <w:left w:w="85" w:type="dxa"/>
-              <w:bottom w:w="85" w:type="dxa"/>
-              <w:right w:w="85" w:type="dxa"/>
-            </w:tcMar>
-            <w:tcBorders>
-              <w:top w:val="single" w:sz="4" w:color="D9D9D9"/>
-              <w:left w:val="single" w:sz="4" w:color="D9D9D9"/>
-              <w:bottom w:val="single" w:sz="4" w:color="D9D9D9"/>
-              <w:right w:val="single" w:sz="4" w:color="D9D9D9"/>
-            </w:tcBorders>
-          </w:tcPr>
-          <w:p>
-            <w:pPr>
-              <w:spacing w:after="40" w:before="40" w:line="240" w:lineRule="auto"/>
-            </w:pPr>
-            <w:r>
-              <w:rPr>
-                <w:rFonts w:ascii="Calibri" w:hAnsi="Calibri"/>
-                <w:b w:val="0"/>
-                <w:color w:val="000000"/>
-                <w:sz w:val="20"/>
-              </w:rPr>
-              <w:t>Response time</w:t>
+            <w:tcW w:type="dxa" w:w="4680"/>
+            <w:vAlign w:val="center"/>
+            <w:tcMar>
+              <w:top w:w="85" w:type="dxa"/>
+              <w:left w:w="85" w:type="dxa"/>
+              <w:bottom w:w="85" w:type="dxa"/>
+              <w:right w:w="85" w:type="dxa"/>
+            </w:tcMar>
+            <w:tcBorders>
+              <w:top w:val="single" w:sz="4" w:color="D9D9D9"/>
+              <w:left w:val="single" w:sz="4" w:color="D9D9D9"/>
+              <w:bottom w:val="single" w:sz="4" w:color="D9D9D9"/>
+              <w:right w:val="single" w:sz="4" w:color="D9D9D9"/>
+            </w:tcBorders>
+          </w:tcPr>
+          <w:p>
+            <w:pPr>
+              <w:spacing w:after="40" w:before="40" w:line="240" w:lineRule="auto"/>
+            </w:pPr>
+            <w:r>
+              <w:rPr>
+                <w:rFonts w:ascii="Calibri" w:hAnsi="Calibri"/>
+                <w:b w:val="0"/>
+                <w:color w:val="000000"/>
+                <w:sz w:val="20"/>
+              </w:rPr>
+              <w:t>TC-025</w:t>
             </w:r>
           </w:p>
         </w:tc>
@@ -5653,7 +5754,7 @@
         </w:trPr>
         <w:tc>
           <w:tcPr>
-            <w:tcW w:type="dxa" w:w="1728"/>
+            <w:tcW w:type="dxa" w:w="1800"/>
             <w:vAlign w:val="center"/>
             <w:tcMar>
               <w:top w:w="85" w:type="dxa"/>
@@ -5685,7 +5786,7 @@
         </w:tc>
         <w:tc>
           <w:tcPr>
-            <w:tcW w:type="dxa" w:w="2016"/>
+            <w:tcW w:type="dxa" w:w="2160"/>
             <w:vAlign w:val="center"/>
             <w:tcMar>
               <w:top w:w="85" w:type="dxa"/>
@@ -5717,33 +5818,33 @@
         </w:tc>
         <w:tc>
           <w:tcPr>
-            <w:tcW w:type="dxa" w:w="4896"/>
-            <w:vAlign w:val="center"/>
-            <w:tcMar>
-              <w:top w:w="85" w:type="dxa"/>
-              <w:left w:w="85" w:type="dxa"/>
-              <w:bottom w:w="85" w:type="dxa"/>
-              <w:right w:w="85" w:type="dxa"/>
-            </w:tcMar>
-            <w:tcBorders>
-              <w:top w:val="single" w:sz="4" w:color="D9D9D9"/>
-              <w:left w:val="single" w:sz="4" w:color="D9D9D9"/>
-              <w:bottom w:val="single" w:sz="4" w:color="D9D9D9"/>
-              <w:right w:val="single" w:sz="4" w:color="D9D9D9"/>
-            </w:tcBorders>
-          </w:tcPr>
-          <w:p>
-            <w:pPr>
-              <w:spacing w:after="40" w:before="40" w:line="240" w:lineRule="auto"/>
-            </w:pPr>
-            <w:r>
-              <w:rPr>
-                <w:rFonts w:ascii="Calibri" w:hAnsi="Calibri"/>
-                <w:b w:val="0"/>
-                <w:color w:val="000000"/>
-                <w:sz w:val="20"/>
-              </w:rPr>
-              <w:t>Availability</w:t>
+            <w:tcW w:type="dxa" w:w="4680"/>
+            <w:vAlign w:val="center"/>
+            <w:tcMar>
+              <w:top w:w="85" w:type="dxa"/>
+              <w:left w:w="85" w:type="dxa"/>
+              <w:bottom w:w="85" w:type="dxa"/>
+              <w:right w:w="85" w:type="dxa"/>
+            </w:tcMar>
+            <w:tcBorders>
+              <w:top w:val="single" w:sz="4" w:color="D9D9D9"/>
+              <w:left w:val="single" w:sz="4" w:color="D9D9D9"/>
+              <w:bottom w:val="single" w:sz="4" w:color="D9D9D9"/>
+              <w:right w:val="single" w:sz="4" w:color="D9D9D9"/>
+            </w:tcBorders>
+          </w:tcPr>
+          <w:p>
+            <w:pPr>
+              <w:spacing w:after="40" w:before="40" w:line="240" w:lineRule="auto"/>
+            </w:pPr>
+            <w:r>
+              <w:rPr>
+                <w:rFonts w:ascii="Calibri" w:hAnsi="Calibri"/>
+                <w:b w:val="0"/>
+                <w:color w:val="000000"/>
+                <w:sz w:val="20"/>
+              </w:rPr>
+              <w:t>TC-026</w:t>
             </w:r>
           </w:p>
         </w:tc>
@@ -5754,7 +5855,7 @@
         </w:trPr>
         <w:tc>
           <w:tcPr>
-            <w:tcW w:type="dxa" w:w="1728"/>
+            <w:tcW w:type="dxa" w:w="1800"/>
             <w:vAlign w:val="center"/>
             <w:tcMar>
               <w:top w:w="85" w:type="dxa"/>
@@ -5786,7 +5887,7 @@
         </w:tc>
         <w:tc>
           <w:tcPr>
-            <w:tcW w:type="dxa" w:w="2016"/>
+            <w:tcW w:type="dxa" w:w="2160"/>
             <w:vAlign w:val="center"/>
             <w:tcMar>
               <w:top w:w="85" w:type="dxa"/>
@@ -5818,33 +5919,33 @@
         </w:tc>
         <w:tc>
           <w:tcPr>
-            <w:tcW w:type="dxa" w:w="4896"/>
-            <w:vAlign w:val="center"/>
-            <w:tcMar>
-              <w:top w:w="85" w:type="dxa"/>
-              <w:left w:w="85" w:type="dxa"/>
-              <w:bottom w:w="85" w:type="dxa"/>
-              <w:right w:w="85" w:type="dxa"/>
-            </w:tcMar>
-            <w:tcBorders>
-              <w:top w:val="single" w:sz="4" w:color="D9D9D9"/>
-              <w:left w:val="single" w:sz="4" w:color="D9D9D9"/>
-              <w:bottom w:val="single" w:sz="4" w:color="D9D9D9"/>
-              <w:right w:val="single" w:sz="4" w:color="D9D9D9"/>
-            </w:tcBorders>
-          </w:tcPr>
-          <w:p>
-            <w:pPr>
-              <w:spacing w:after="40" w:before="40" w:line="240" w:lineRule="auto"/>
-            </w:pPr>
-            <w:r>
-              <w:rPr>
-                <w:rFonts w:ascii="Calibri" w:hAnsi="Calibri"/>
-                <w:b w:val="0"/>
-                <w:color w:val="000000"/>
-                <w:sz w:val="20"/>
-              </w:rPr>
-              <w:t>Recovery</w:t>
+            <w:tcW w:type="dxa" w:w="4680"/>
+            <w:vAlign w:val="center"/>
+            <w:tcMar>
+              <w:top w:w="85" w:type="dxa"/>
+              <w:left w:w="85" w:type="dxa"/>
+              <w:bottom w:w="85" w:type="dxa"/>
+              <w:right w:w="85" w:type="dxa"/>
+            </w:tcMar>
+            <w:tcBorders>
+              <w:top w:val="single" w:sz="4" w:color="D9D9D9"/>
+              <w:left w:val="single" w:sz="4" w:color="D9D9D9"/>
+              <w:bottom w:val="single" w:sz="4" w:color="D9D9D9"/>
+              <w:right w:val="single" w:sz="4" w:color="D9D9D9"/>
+            </w:tcBorders>
+          </w:tcPr>
+          <w:p>
+            <w:pPr>
+              <w:spacing w:after="40" w:before="40" w:line="240" w:lineRule="auto"/>
+            </w:pPr>
+            <w:r>
+              <w:rPr>
+                <w:rFonts w:ascii="Calibri" w:hAnsi="Calibri"/>
+                <w:b w:val="0"/>
+                <w:color w:val="000000"/>
+                <w:sz w:val="20"/>
+              </w:rPr>
+              <w:t>TC-027</w:t>
             </w:r>
           </w:p>
         </w:tc>
@@ -5855,7 +5956,7 @@
         </w:trPr>
         <w:tc>
           <w:tcPr>
-            <w:tcW w:type="dxa" w:w="1728"/>
+            <w:tcW w:type="dxa" w:w="1800"/>
             <w:vAlign w:val="center"/>
             <w:tcMar>
               <w:top w:w="85" w:type="dxa"/>
@@ -5887,7 +5988,7 @@
         </w:tc>
         <w:tc>
           <w:tcPr>
-            <w:tcW w:type="dxa" w:w="2016"/>
+            <w:tcW w:type="dxa" w:w="2160"/>
             <w:vAlign w:val="center"/>
             <w:tcMar>
               <w:top w:w="85" w:type="dxa"/>
@@ -5919,33 +6020,33 @@
         </w:tc>
         <w:tc>
           <w:tcPr>
-            <w:tcW w:type="dxa" w:w="4896"/>
-            <w:vAlign w:val="center"/>
-            <w:tcMar>
-              <w:top w:w="85" w:type="dxa"/>
-              <w:left w:w="85" w:type="dxa"/>
-              <w:bottom w:w="85" w:type="dxa"/>
-              <w:right w:w="85" w:type="dxa"/>
-            </w:tcMar>
-            <w:tcBorders>
-              <w:top w:val="single" w:sz="4" w:color="D9D9D9"/>
-              <w:left w:val="single" w:sz="4" w:color="D9D9D9"/>
-              <w:bottom w:val="single" w:sz="4" w:color="D9D9D9"/>
-              <w:right w:val="single" w:sz="4" w:color="D9D9D9"/>
-            </w:tcBorders>
-          </w:tcPr>
-          <w:p>
-            <w:pPr>
-              <w:spacing w:after="40" w:before="40" w:line="240" w:lineRule="auto"/>
-            </w:pPr>
-            <w:r>
-              <w:rPr>
-                <w:rFonts w:ascii="Calibri" w:hAnsi="Calibri"/>
-                <w:b w:val="0"/>
-                <w:color w:val="000000"/>
-                <w:sz w:val="20"/>
-              </w:rPr>
-              <w:t>Accessibility</w:t>
+            <w:tcW w:type="dxa" w:w="4680"/>
+            <w:vAlign w:val="center"/>
+            <w:tcMar>
+              <w:top w:w="85" w:type="dxa"/>
+              <w:left w:w="85" w:type="dxa"/>
+              <w:bottom w:w="85" w:type="dxa"/>
+              <w:right w:w="85" w:type="dxa"/>
+            </w:tcMar>
+            <w:tcBorders>
+              <w:top w:val="single" w:sz="4" w:color="D9D9D9"/>
+              <w:left w:val="single" w:sz="4" w:color="D9D9D9"/>
+              <w:bottom w:val="single" w:sz="4" w:color="D9D9D9"/>
+              <w:right w:val="single" w:sz="4" w:color="D9D9D9"/>
+            </w:tcBorders>
+          </w:tcPr>
+          <w:p>
+            <w:pPr>
+              <w:spacing w:after="40" w:before="40" w:line="240" w:lineRule="auto"/>
+            </w:pPr>
+            <w:r>
+              <w:rPr>
+                <w:rFonts w:ascii="Calibri" w:hAnsi="Calibri"/>
+                <w:b w:val="0"/>
+                <w:color w:val="000000"/>
+                <w:sz w:val="20"/>
+              </w:rPr>
+              <w:t>TC-028</w:t>
             </w:r>
           </w:p>
         </w:tc>
@@ -5956,7 +6057,7 @@
         </w:trPr>
         <w:tc>
           <w:tcPr>
-            <w:tcW w:type="dxa" w:w="1728"/>
+            <w:tcW w:type="dxa" w:w="1800"/>
             <w:vAlign w:val="center"/>
             <w:tcMar>
               <w:top w:w="85" w:type="dxa"/>
@@ -5988,7 +6089,7 @@
         </w:tc>
         <w:tc>
           <w:tcPr>
-            <w:tcW w:type="dxa" w:w="2016"/>
+            <w:tcW w:type="dxa" w:w="2160"/>
             <w:vAlign w:val="center"/>
             <w:tcMar>
               <w:top w:w="85" w:type="dxa"/>
@@ -6020,33 +6121,33 @@
         </w:tc>
         <w:tc>
           <w:tcPr>
-            <w:tcW w:type="dxa" w:w="4896"/>
-            <w:vAlign w:val="center"/>
-            <w:tcMar>
-              <w:top w:w="85" w:type="dxa"/>
-              <w:left w:w="85" w:type="dxa"/>
-              <w:bottom w:w="85" w:type="dxa"/>
-              <w:right w:w="85" w:type="dxa"/>
-            </w:tcMar>
-            <w:tcBorders>
-              <w:top w:val="single" w:sz="4" w:color="D9D9D9"/>
-              <w:left w:val="single" w:sz="4" w:color="D9D9D9"/>
-              <w:bottom w:val="single" w:sz="4" w:color="D9D9D9"/>
-              <w:right w:val="single" w:sz="4" w:color="D9D9D9"/>
-            </w:tcBorders>
-          </w:tcPr>
-          <w:p>
-            <w:pPr>
-              <w:spacing w:after="40" w:before="40" w:line="240" w:lineRule="auto"/>
-            </w:pPr>
-            <w:r>
-              <w:rPr>
-                <w:rFonts w:ascii="Calibri" w:hAnsi="Calibri"/>
-                <w:b w:val="0"/>
-                <w:color w:val="000000"/>
-                <w:sz w:val="20"/>
-              </w:rPr>
-              <w:t>Maintainability</w:t>
+            <w:tcW w:type="dxa" w:w="4680"/>
+            <w:vAlign w:val="center"/>
+            <w:tcMar>
+              <w:top w:w="85" w:type="dxa"/>
+              <w:left w:w="85" w:type="dxa"/>
+              <w:bottom w:w="85" w:type="dxa"/>
+              <w:right w:w="85" w:type="dxa"/>
+            </w:tcMar>
+            <w:tcBorders>
+              <w:top w:val="single" w:sz="4" w:color="D9D9D9"/>
+              <w:left w:val="single" w:sz="4" w:color="D9D9D9"/>
+              <w:bottom w:val="single" w:sz="4" w:color="D9D9D9"/>
+              <w:right w:val="single" w:sz="4" w:color="D9D9D9"/>
+            </w:tcBorders>
+          </w:tcPr>
+          <w:p>
+            <w:pPr>
+              <w:spacing w:after="40" w:before="40" w:line="240" w:lineRule="auto"/>
+            </w:pPr>
+            <w:r>
+              <w:rPr>
+                <w:rFonts w:ascii="Calibri" w:hAnsi="Calibri"/>
+                <w:b w:val="0"/>
+                <w:color w:val="000000"/>
+                <w:sz w:val="20"/>
+              </w:rPr>
+              <w:t>TC-029</w:t>
             </w:r>
           </w:p>
         </w:tc>
@@ -6057,7 +6158,7 @@
         </w:trPr>
         <w:tc>
           <w:tcPr>
-            <w:tcW w:type="dxa" w:w="1728"/>
+            <w:tcW w:type="dxa" w:w="1800"/>
             <w:vAlign w:val="center"/>
             <w:tcMar>
               <w:top w:w="85" w:type="dxa"/>
@@ -6089,7 +6190,7 @@
         </w:tc>
         <w:tc>
           <w:tcPr>
-            <w:tcW w:type="dxa" w:w="2016"/>
+            <w:tcW w:type="dxa" w:w="2160"/>
             <w:vAlign w:val="center"/>
             <w:tcMar>
               <w:top w:w="85" w:type="dxa"/>
@@ -6121,33 +6222,33 @@
         </w:tc>
         <w:tc>
           <w:tcPr>
-            <w:tcW w:type="dxa" w:w="4896"/>
-            <w:vAlign w:val="center"/>
-            <w:tcMar>
-              <w:top w:w="85" w:type="dxa"/>
-              <w:left w:w="85" w:type="dxa"/>
-              <w:bottom w:w="85" w:type="dxa"/>
-              <w:right w:w="85" w:type="dxa"/>
-            </w:tcMar>
-            <w:tcBorders>
-              <w:top w:val="single" w:sz="4" w:color="D9D9D9"/>
-              <w:left w:val="single" w:sz="4" w:color="D9D9D9"/>
-              <w:bottom w:val="single" w:sz="4" w:color="D9D9D9"/>
-              <w:right w:val="single" w:sz="4" w:color="D9D9D9"/>
-            </w:tcBorders>
-          </w:tcPr>
-          <w:p>
-            <w:pPr>
-              <w:spacing w:after="40" w:before="40" w:line="240" w:lineRule="auto"/>
-            </w:pPr>
-            <w:r>
-              <w:rPr>
-                <w:rFonts w:ascii="Calibri" w:hAnsi="Calibri"/>
-                <w:b w:val="0"/>
-                <w:color w:val="000000"/>
-                <w:sz w:val="20"/>
-              </w:rPr>
-              <w:t>Audit retention</w:t>
+            <w:tcW w:type="dxa" w:w="4680"/>
+            <w:vAlign w:val="center"/>
+            <w:tcMar>
+              <w:top w:w="85" w:type="dxa"/>
+              <w:left w:w="85" w:type="dxa"/>
+              <w:bottom w:w="85" w:type="dxa"/>
+              <w:right w:w="85" w:type="dxa"/>
+            </w:tcMar>
+            <w:tcBorders>
+              <w:top w:val="single" w:sz="4" w:color="D9D9D9"/>
+              <w:left w:val="single" w:sz="4" w:color="D9D9D9"/>
+              <w:bottom w:val="single" w:sz="4" w:color="D9D9D9"/>
+              <w:right w:val="single" w:sz="4" w:color="D9D9D9"/>
+            </w:tcBorders>
+          </w:tcPr>
+          <w:p>
+            <w:pPr>
+              <w:spacing w:after="40" w:before="40" w:line="240" w:lineRule="auto"/>
+            </w:pPr>
+            <w:r>
+              <w:rPr>
+                <w:rFonts w:ascii="Calibri" w:hAnsi="Calibri"/>
+                <w:b w:val="0"/>
+                <w:color w:val="000000"/>
+                <w:sz w:val="20"/>
+              </w:rPr>
+              <w:t>TC-030</w:t>
             </w:r>
           </w:p>
         </w:tc>
@@ -6158,7 +6259,7 @@
         </w:trPr>
         <w:tc>
           <w:tcPr>
-            <w:tcW w:type="dxa" w:w="1728"/>
+            <w:tcW w:type="dxa" w:w="1800"/>
             <w:vAlign w:val="center"/>
             <w:tcMar>
               <w:top w:w="85" w:type="dxa"/>
@@ -6190,7 +6291,7 @@
         </w:tc>
         <w:tc>
           <w:tcPr>
-            <w:tcW w:type="dxa" w:w="2016"/>
+            <w:tcW w:type="dxa" w:w="2160"/>
             <w:vAlign w:val="center"/>
             <w:tcMar>
               <w:top w:w="85" w:type="dxa"/>
@@ -6222,33 +6323,33 @@
         </w:tc>
         <w:tc>
           <w:tcPr>
-            <w:tcW w:type="dxa" w:w="4896"/>
-            <w:vAlign w:val="center"/>
-            <w:tcMar>
-              <w:top w:w="85" w:type="dxa"/>
-              <w:left w:w="85" w:type="dxa"/>
-              <w:bottom w:w="85" w:type="dxa"/>
-              <w:right w:w="85" w:type="dxa"/>
-            </w:tcMar>
-            <w:tcBorders>
-              <w:top w:val="single" w:sz="4" w:color="D9D9D9"/>
-              <w:left w:val="single" w:sz="4" w:color="D9D9D9"/>
-              <w:bottom w:val="single" w:sz="4" w:color="D9D9D9"/>
-              <w:right w:val="single" w:sz="4" w:color="D9D9D9"/>
-            </w:tcBorders>
-          </w:tcPr>
-          <w:p>
-            <w:pPr>
-              <w:spacing w:after="40" w:before="40" w:line="240" w:lineRule="auto"/>
-            </w:pPr>
-            <w:r>
-              <w:rPr>
-                <w:rFonts w:ascii="Calibri" w:hAnsi="Calibri"/>
-                <w:b w:val="0"/>
-                <w:color w:val="000000"/>
-                <w:sz w:val="20"/>
-              </w:rPr>
-              <w:t>Protected transport</w:t>
+            <w:tcW w:type="dxa" w:w="4680"/>
+            <w:vAlign w:val="center"/>
+            <w:tcMar>
+              <w:top w:w="85" w:type="dxa"/>
+              <w:left w:w="85" w:type="dxa"/>
+              <w:bottom w:w="85" w:type="dxa"/>
+              <w:right w:w="85" w:type="dxa"/>
+            </w:tcMar>
+            <w:tcBorders>
+              <w:top w:val="single" w:sz="4" w:color="D9D9D9"/>
+              <w:left w:val="single" w:sz="4" w:color="D9D9D9"/>
+              <w:bottom w:val="single" w:sz="4" w:color="D9D9D9"/>
+              <w:right w:val="single" w:sz="4" w:color="D9D9D9"/>
+            </w:tcBorders>
+          </w:tcPr>
+          <w:p>
+            <w:pPr>
+              <w:spacing w:after="40" w:before="40" w:line="240" w:lineRule="auto"/>
+            </w:pPr>
+            <w:r>
+              <w:rPr>
+                <w:rFonts w:ascii="Calibri" w:hAnsi="Calibri"/>
+                <w:b w:val="0"/>
+                <w:color w:val="000000"/>
+                <w:sz w:val="20"/>
+              </w:rPr>
+              <w:t>TC-031</w:t>
             </w:r>
           </w:p>
         </w:tc>
@@ -6259,7 +6360,7 @@
         </w:trPr>
         <w:tc>
           <w:tcPr>
-            <w:tcW w:type="dxa" w:w="1728"/>
+            <w:tcW w:type="dxa" w:w="1800"/>
             <w:vAlign w:val="center"/>
             <w:tcMar>
               <w:top w:w="85" w:type="dxa"/>
@@ -6291,7 +6392,7 @@
         </w:tc>
         <w:tc>
           <w:tcPr>
-            <w:tcW w:type="dxa" w:w="2016"/>
+            <w:tcW w:type="dxa" w:w="2160"/>
             <w:vAlign w:val="center"/>
             <w:tcMar>
               <w:top w:w="85" w:type="dxa"/>
@@ -6323,33 +6424,33 @@
         </w:tc>
         <w:tc>
           <w:tcPr>
-            <w:tcW w:type="dxa" w:w="4896"/>
-            <w:vAlign w:val="center"/>
-            <w:tcMar>
-              <w:top w:w="85" w:type="dxa"/>
-              <w:left w:w="85" w:type="dxa"/>
-              <w:bottom w:w="85" w:type="dxa"/>
-              <w:right w:w="85" w:type="dxa"/>
-            </w:tcMar>
-            <w:tcBorders>
-              <w:top w:val="single" w:sz="4" w:color="D9D9D9"/>
-              <w:left w:val="single" w:sz="4" w:color="D9D9D9"/>
-              <w:bottom w:val="single" w:sz="4" w:color="D9D9D9"/>
-              <w:right w:val="single" w:sz="4" w:color="D9D9D9"/>
-            </w:tcBorders>
-          </w:tcPr>
-          <w:p>
-            <w:pPr>
-              <w:spacing w:after="40" w:before="40" w:line="240" w:lineRule="auto"/>
-            </w:pPr>
-            <w:r>
-              <w:rPr>
-                <w:rFonts w:ascii="Calibri" w:hAnsi="Calibri"/>
-                <w:b w:val="0"/>
-                <w:color w:val="000000"/>
-                <w:sz w:val="20"/>
-              </w:rPr>
-              <w:t>Authorization at the server</w:t>
+            <w:tcW w:type="dxa" w:w="4680"/>
+            <w:vAlign w:val="center"/>
+            <w:tcMar>
+              <w:top w:w="85" w:type="dxa"/>
+              <w:left w:w="85" w:type="dxa"/>
+              <w:bottom w:w="85" w:type="dxa"/>
+              <w:right w:w="85" w:type="dxa"/>
+            </w:tcMar>
+            <w:tcBorders>
+              <w:top w:val="single" w:sz="4" w:color="D9D9D9"/>
+              <w:left w:val="single" w:sz="4" w:color="D9D9D9"/>
+              <w:bottom w:val="single" w:sz="4" w:color="D9D9D9"/>
+              <w:right w:val="single" w:sz="4" w:color="D9D9D9"/>
+            </w:tcBorders>
+          </w:tcPr>
+          <w:p>
+            <w:pPr>
+              <w:spacing w:after="40" w:before="40" w:line="240" w:lineRule="auto"/>
+            </w:pPr>
+            <w:r>
+              <w:rPr>
+                <w:rFonts w:ascii="Calibri" w:hAnsi="Calibri"/>
+                <w:b w:val="0"/>
+                <w:color w:val="000000"/>
+                <w:sz w:val="20"/>
+              </w:rPr>
+              <w:t>TC-032</w:t>
             </w:r>
           </w:p>
         </w:tc>
@@ -6360,7 +6461,7 @@
         </w:trPr>
         <w:tc>
           <w:tcPr>
-            <w:tcW w:type="dxa" w:w="1728"/>
+            <w:tcW w:type="dxa" w:w="1800"/>
             <w:vAlign w:val="center"/>
             <w:tcMar>
               <w:top w:w="85" w:type="dxa"/>
@@ -6392,7 +6493,7 @@
         </w:tc>
         <w:tc>
           <w:tcPr>
-            <w:tcW w:type="dxa" w:w="2016"/>
+            <w:tcW w:type="dxa" w:w="2160"/>
             <w:vAlign w:val="center"/>
             <w:tcMar>
               <w:top w:w="85" w:type="dxa"/>
@@ -6424,33 +6525,33 @@
         </w:tc>
         <w:tc>
           <w:tcPr>
-            <w:tcW w:type="dxa" w:w="4896"/>
-            <w:vAlign w:val="center"/>
-            <w:tcMar>
-              <w:top w:w="85" w:type="dxa"/>
-              <w:left w:w="85" w:type="dxa"/>
-              <w:bottom w:w="85" w:type="dxa"/>
-              <w:right w:w="85" w:type="dxa"/>
-            </w:tcMar>
-            <w:tcBorders>
-              <w:top w:val="single" w:sz="4" w:color="D9D9D9"/>
-              <w:left w:val="single" w:sz="4" w:color="D9D9D9"/>
-              <w:bottom w:val="single" w:sz="4" w:color="D9D9D9"/>
-              <w:right w:val="single" w:sz="4" w:color="D9D9D9"/>
-            </w:tcBorders>
-          </w:tcPr>
-          <w:p>
-            <w:pPr>
-              <w:spacing w:after="40" w:before="40" w:line="240" w:lineRule="auto"/>
-            </w:pPr>
-            <w:r>
-              <w:rPr>
-                <w:rFonts w:ascii="Calibri" w:hAnsi="Calibri"/>
-                <w:b w:val="0"/>
-                <w:color w:val="000000"/>
-                <w:sz w:val="20"/>
-              </w:rPr>
-              <w:t>Credentials and sessions</w:t>
+            <w:tcW w:type="dxa" w:w="4680"/>
+            <w:vAlign w:val="center"/>
+            <w:tcMar>
+              <w:top w:w="85" w:type="dxa"/>
+              <w:left w:w="85" w:type="dxa"/>
+              <w:bottom w:w="85" w:type="dxa"/>
+              <w:right w:w="85" w:type="dxa"/>
+            </w:tcMar>
+            <w:tcBorders>
+              <w:top w:val="single" w:sz="4" w:color="D9D9D9"/>
+              <w:left w:val="single" w:sz="4" w:color="D9D9D9"/>
+              <w:bottom w:val="single" w:sz="4" w:color="D9D9D9"/>
+              <w:right w:val="single" w:sz="4" w:color="D9D9D9"/>
+            </w:tcBorders>
+          </w:tcPr>
+          <w:p>
+            <w:pPr>
+              <w:spacing w:after="40" w:before="40" w:line="240" w:lineRule="auto"/>
+            </w:pPr>
+            <w:r>
+              <w:rPr>
+                <w:rFonts w:ascii="Calibri" w:hAnsi="Calibri"/>
+                <w:b w:val="0"/>
+                <w:color w:val="000000"/>
+                <w:sz w:val="20"/>
+              </w:rPr>
+              <w:t>TC-033</w:t>
             </w:r>
           </w:p>
         </w:tc>
@@ -6461,7 +6562,7 @@
         </w:trPr>
         <w:tc>
           <w:tcPr>
-            <w:tcW w:type="dxa" w:w="1728"/>
+            <w:tcW w:type="dxa" w:w="1800"/>
             <w:vAlign w:val="center"/>
             <w:tcMar>
               <w:top w:w="85" w:type="dxa"/>
@@ -6493,7 +6594,7 @@
         </w:tc>
         <w:tc>
           <w:tcPr>
-            <w:tcW w:type="dxa" w:w="2016"/>
+            <w:tcW w:type="dxa" w:w="2160"/>
             <w:vAlign w:val="center"/>
             <w:tcMar>
               <w:top w:w="85" w:type="dxa"/>
@@ -6525,33 +6626,33 @@
         </w:tc>
         <w:tc>
           <w:tcPr>
-            <w:tcW w:type="dxa" w:w="4896"/>
-            <w:vAlign w:val="center"/>
-            <w:tcMar>
-              <w:top w:w="85" w:type="dxa"/>
-              <w:left w:w="85" w:type="dxa"/>
-              <w:bottom w:w="85" w:type="dxa"/>
-              <w:right w:w="85" w:type="dxa"/>
-            </w:tcMar>
-            <w:tcBorders>
-              <w:top w:val="single" w:sz="4" w:color="D9D9D9"/>
-              <w:left w:val="single" w:sz="4" w:color="D9D9D9"/>
-              <w:bottom w:val="single" w:sz="4" w:color="D9D9D9"/>
-              <w:right w:val="single" w:sz="4" w:color="D9D9D9"/>
-            </w:tcBorders>
-          </w:tcPr>
-          <w:p>
-            <w:pPr>
-              <w:spacing w:after="40" w:before="40" w:line="240" w:lineRule="auto"/>
-            </w:pPr>
-            <w:r>
-              <w:rPr>
-                <w:rFonts w:ascii="Calibri" w:hAnsi="Calibri"/>
-                <w:b w:val="0"/>
-                <w:color w:val="000000"/>
-                <w:sz w:val="20"/>
-              </w:rPr>
-              <w:t>Safe input and files</w:t>
+            <w:tcW w:type="dxa" w:w="4680"/>
+            <w:vAlign w:val="center"/>
+            <w:tcMar>
+              <w:top w:w="85" w:type="dxa"/>
+              <w:left w:w="85" w:type="dxa"/>
+              <w:bottom w:w="85" w:type="dxa"/>
+              <w:right w:w="85" w:type="dxa"/>
+            </w:tcMar>
+            <w:tcBorders>
+              <w:top w:val="single" w:sz="4" w:color="D9D9D9"/>
+              <w:left w:val="single" w:sz="4" w:color="D9D9D9"/>
+              <w:bottom w:val="single" w:sz="4" w:color="D9D9D9"/>
+              <w:right w:val="single" w:sz="4" w:color="D9D9D9"/>
+            </w:tcBorders>
+          </w:tcPr>
+          <w:p>
+            <w:pPr>
+              <w:spacing w:after="40" w:before="40" w:line="240" w:lineRule="auto"/>
+            </w:pPr>
+            <w:r>
+              <w:rPr>
+                <w:rFonts w:ascii="Calibri" w:hAnsi="Calibri"/>
+                <w:b w:val="0"/>
+                <w:color w:val="000000"/>
+                <w:sz w:val="20"/>
+              </w:rPr>
+              <w:t>TC-034</w:t>
             </w:r>
           </w:p>
         </w:tc>
@@ -6562,7 +6663,7 @@
         </w:trPr>
         <w:tc>
           <w:tcPr>
-            <w:tcW w:type="dxa" w:w="1728"/>
+            <w:tcW w:type="dxa" w:w="1800"/>
             <w:vAlign w:val="center"/>
             <w:tcMar>
               <w:top w:w="85" w:type="dxa"/>
@@ -6594,7 +6695,7 @@
         </w:tc>
         <w:tc>
           <w:tcPr>
-            <w:tcW w:type="dxa" w:w="2016"/>
+            <w:tcW w:type="dxa" w:w="2160"/>
             <w:vAlign w:val="center"/>
             <w:tcMar>
               <w:top w:w="85" w:type="dxa"/>
@@ -6626,33 +6727,33 @@
         </w:tc>
         <w:tc>
           <w:tcPr>
-            <w:tcW w:type="dxa" w:w="4896"/>
-            <w:vAlign w:val="center"/>
-            <w:tcMar>
-              <w:top w:w="85" w:type="dxa"/>
-              <w:left w:w="85" w:type="dxa"/>
-              <w:bottom w:w="85" w:type="dxa"/>
-              <w:right w:w="85" w:type="dxa"/>
-            </w:tcMar>
-            <w:tcBorders>
-              <w:top w:val="single" w:sz="4" w:color="D9D9D9"/>
-              <w:left w:val="single" w:sz="4" w:color="D9D9D9"/>
-              <w:bottom w:val="single" w:sz="4" w:color="D9D9D9"/>
-              <w:right w:val="single" w:sz="4" w:color="D9D9D9"/>
-            </w:tcBorders>
-          </w:tcPr>
-          <w:p>
-            <w:pPr>
-              <w:spacing w:after="40" w:before="40" w:line="240" w:lineRule="auto"/>
-            </w:pPr>
-            <w:r>
-              <w:rPr>
-                <w:rFonts w:ascii="Calibri" w:hAnsi="Calibri"/>
-                <w:b w:val="0"/>
-                <w:color w:val="000000"/>
-                <w:sz w:val="20"/>
-              </w:rPr>
-              <w:t>Sensitive data protection</w:t>
+            <w:tcW w:type="dxa" w:w="4680"/>
+            <w:vAlign w:val="center"/>
+            <w:tcMar>
+              <w:top w:w="85" w:type="dxa"/>
+              <w:left w:w="85" w:type="dxa"/>
+              <w:bottom w:w="85" w:type="dxa"/>
+              <w:right w:w="85" w:type="dxa"/>
+            </w:tcMar>
+            <w:tcBorders>
+              <w:top w:val="single" w:sz="4" w:color="D9D9D9"/>
+              <w:left w:val="single" w:sz="4" w:color="D9D9D9"/>
+              <w:bottom w:val="single" w:sz="4" w:color="D9D9D9"/>
+              <w:right w:val="single" w:sz="4" w:color="D9D9D9"/>
+            </w:tcBorders>
+          </w:tcPr>
+          <w:p>
+            <w:pPr>
+              <w:spacing w:after="40" w:before="40" w:line="240" w:lineRule="auto"/>
+            </w:pPr>
+            <w:r>
+              <w:rPr>
+                <w:rFonts w:ascii="Calibri" w:hAnsi="Calibri"/>
+                <w:b w:val="0"/>
+                <w:color w:val="000000"/>
+                <w:sz w:val="20"/>
+              </w:rPr>
+              <w:t>TC-035</w:t>
             </w:r>
           </w:p>
         </w:tc>
@@ -6663,7 +6764,7 @@
         </w:trPr>
         <w:tc>
           <w:tcPr>
-            <w:tcW w:type="dxa" w:w="1728"/>
+            <w:tcW w:type="dxa" w:w="1800"/>
             <w:vAlign w:val="center"/>
             <w:tcMar>
               <w:top w:w="85" w:type="dxa"/>
@@ -6695,7 +6796,7 @@
         </w:tc>
         <w:tc>
           <w:tcPr>
-            <w:tcW w:type="dxa" w:w="2016"/>
+            <w:tcW w:type="dxa" w:w="2160"/>
             <w:vAlign w:val="center"/>
             <w:tcMar>
               <w:top w:w="85" w:type="dxa"/>
@@ -6727,33 +6828,33 @@
         </w:tc>
         <w:tc>
           <w:tcPr>
-            <w:tcW w:type="dxa" w:w="4896"/>
-            <w:vAlign w:val="center"/>
-            <w:tcMar>
-              <w:top w:w="85" w:type="dxa"/>
-              <w:left w:w="85" w:type="dxa"/>
-              <w:bottom w:w="85" w:type="dxa"/>
-              <w:right w:w="85" w:type="dxa"/>
-            </w:tcMar>
-            <w:tcBorders>
-              <w:top w:val="single" w:sz="4" w:color="D9D9D9"/>
-              <w:left w:val="single" w:sz="4" w:color="D9D9D9"/>
-              <w:bottom w:val="single" w:sz="4" w:color="D9D9D9"/>
-              <w:right w:val="single" w:sz="4" w:color="D9D9D9"/>
-            </w:tcBorders>
-          </w:tcPr>
-          <w:p>
-            <w:pPr>
-              <w:spacing w:after="40" w:before="40" w:line="240" w:lineRule="auto"/>
-            </w:pPr>
-            <w:r>
-              <w:rPr>
-                <w:rFonts w:ascii="Calibri" w:hAnsi="Calibri"/>
-                <w:b w:val="0"/>
-                <w:color w:val="000000"/>
-                <w:sz w:val="20"/>
-              </w:rPr>
-              <w:t>Audit integrity and separation</w:t>
+            <w:tcW w:type="dxa" w:w="4680"/>
+            <w:vAlign w:val="center"/>
+            <w:tcMar>
+              <w:top w:w="85" w:type="dxa"/>
+              <w:left w:w="85" w:type="dxa"/>
+              <w:bottom w:w="85" w:type="dxa"/>
+              <w:right w:w="85" w:type="dxa"/>
+            </w:tcMar>
+            <w:tcBorders>
+              <w:top w:val="single" w:sz="4" w:color="D9D9D9"/>
+              <w:left w:val="single" w:sz="4" w:color="D9D9D9"/>
+              <w:bottom w:val="single" w:sz="4" w:color="D9D9D9"/>
+              <w:right w:val="single" w:sz="4" w:color="D9D9D9"/>
+            </w:tcBorders>
+          </w:tcPr>
+          <w:p>
+            <w:pPr>
+              <w:spacing w:after="40" w:before="40" w:line="240" w:lineRule="auto"/>
+            </w:pPr>
+            <w:r>
+              <w:rPr>
+                <w:rFonts w:ascii="Calibri" w:hAnsi="Calibri"/>
+                <w:b w:val="0"/>
+                <w:color w:val="000000"/>
+                <w:sz w:val="20"/>
+              </w:rPr>
+              <w:t>TC-036</w:t>
             </w:r>
           </w:p>
         </w:tc>
@@ -6764,7 +6865,7 @@
         </w:trPr>
         <w:tc>
           <w:tcPr>
-            <w:tcW w:type="dxa" w:w="1728"/>
+            <w:tcW w:type="dxa" w:w="1800"/>
             <w:vAlign w:val="center"/>
             <w:tcMar>
               <w:top w:w="85" w:type="dxa"/>
@@ -6796,7 +6897,7 @@
         </w:tc>
         <w:tc>
           <w:tcPr>
-            <w:tcW w:type="dxa" w:w="2016"/>
+            <w:tcW w:type="dxa" w:w="2160"/>
             <w:vAlign w:val="center"/>
             <w:tcMar>
               <w:top w:w="85" w:type="dxa"/>
@@ -6828,33 +6929,33 @@
         </w:tc>
         <w:tc>
           <w:tcPr>
-            <w:tcW w:type="dxa" w:w="4896"/>
-            <w:vAlign w:val="center"/>
-            <w:tcMar>
-              <w:top w:w="85" w:type="dxa"/>
-              <w:left w:w="85" w:type="dxa"/>
-              <w:bottom w:w="85" w:type="dxa"/>
-              <w:right w:w="85" w:type="dxa"/>
-            </w:tcMar>
-            <w:tcBorders>
-              <w:top w:val="single" w:sz="4" w:color="D9D9D9"/>
-              <w:left w:val="single" w:sz="4" w:color="D9D9D9"/>
-              <w:bottom w:val="single" w:sz="4" w:color="D9D9D9"/>
-              <w:right w:val="single" w:sz="4" w:color="D9D9D9"/>
-            </w:tcBorders>
-          </w:tcPr>
-          <w:p>
-            <w:pPr>
-              <w:spacing w:after="40" w:before="40" w:line="240" w:lineRule="auto"/>
-            </w:pPr>
-            <w:r>
-              <w:rPr>
-                <w:rFonts w:ascii="Calibri" w:hAnsi="Calibri"/>
-                <w:b w:val="0"/>
-                <w:color w:val="000000"/>
-                <w:sz w:val="20"/>
-              </w:rPr>
-              <w:t>Abuse control</w:t>
+            <w:tcW w:type="dxa" w:w="4680"/>
+            <w:vAlign w:val="center"/>
+            <w:tcMar>
+              <w:top w:w="85" w:type="dxa"/>
+              <w:left w:w="85" w:type="dxa"/>
+              <w:bottom w:w="85" w:type="dxa"/>
+              <w:right w:w="85" w:type="dxa"/>
+            </w:tcMar>
+            <w:tcBorders>
+              <w:top w:val="single" w:sz="4" w:color="D9D9D9"/>
+              <w:left w:val="single" w:sz="4" w:color="D9D9D9"/>
+              <w:bottom w:val="single" w:sz="4" w:color="D9D9D9"/>
+              <w:right w:val="single" w:sz="4" w:color="D9D9D9"/>
+            </w:tcBorders>
+          </w:tcPr>
+          <w:p>
+            <w:pPr>
+              <w:spacing w:after="40" w:before="40" w:line="240" w:lineRule="auto"/>
+            </w:pPr>
+            <w:r>
+              <w:rPr>
+                <w:rFonts w:ascii="Calibri" w:hAnsi="Calibri"/>
+                <w:b w:val="0"/>
+                <w:color w:val="000000"/>
+                <w:sz w:val="20"/>
+              </w:rPr>
+              <w:t>TC-037</w:t>
             </w:r>
           </w:p>
         </w:tc>
@@ -10333,7 +10434,7 @@
           <w:b w:val="0"/>
           <w:sz w:val="22"/>
         </w:rPr>
-        <w:t>Project problem statement supplied by Team 07; Insurance_Workflow_SRS.docx v1.0; Insurance_Workflow_STP.docx v1.0. The supplied SAD template controls the academic structure. No certification or external compliance claim is made.</w:t>
+        <w:t>Project problem statement supplied by Team 07; Insurance_Workflow_SRS.docx v1.1; Insurance_Workflow_STP.docx v1.1. The supplied SAD template controls the academic structure. No certification or external compliance claim is made.</w:t>
       </w:r>
     </w:p>
     <w:p>
@@ -10359,6 +10460,44 @@
           <w:sz w:val="22"/>
         </w:rPr>
         <w:t>Document generation uses Python DOCX/OOXML tools and embedded PNG diagrams. Proposed implementation verification uses unit/API/browser tests and a load generator selected after the stack is confirmed. These testing tools have not been run against an application.</w:t>
+      </w:r>
+    </w:p>
+    <w:p>
+      <w:pPr>
+        <w:pStyle w:val="Heading2"/>
+        <w:keepNext/>
+      </w:pPr>
+      <w:r>
+        <w:rPr>
+          <w:color w:val="000000"/>
+        </w:rPr>
+        <w:t>5.4 Integrated baseline verification</w:t>
+      </w:r>
+    </w:p>
+    <w:p>
+      <w:pPr>
+        <w:spacing w:after="120" w:line="254" w:lineRule="auto"/>
+      </w:pPr>
+      <w:r>
+        <w:rPr>
+          <w:rFonts w:ascii="Calibri" w:hAnsi="Calibri"/>
+          <w:b w:val="0"/>
+          <w:sz w:val="22"/>
+        </w:rPr>
+        <w:t>The v1.1 mapping in section 3.8 now connects all 31 SRS requirements to the 8 proposed components and all 37 STP cases. The SRS lifecycle, file limits, inclusive policy dates, retry schedule, role boundaries and quality targets are consistent with this design. These are documentation checks, not evidence of an implemented system.</w:t>
+      </w:r>
+    </w:p>
+    <w:p>
+      <w:pPr>
+        <w:spacing w:after="120" w:line="254" w:lineRule="auto"/>
+      </w:pPr>
+      <w:r>
+        <w:rPr>
+          <w:rFonts w:ascii="Calibri" w:hAnsi="Calibri"/>
+          <w:b w:val="0"/>
+          <w:sz w:val="22"/>
+        </w:rPr>
+        <w:t>Integration prepared with AI assistance for Anuj Srijan on 12 October 2026. Stakeholder signatures are pending; no personal review approval is inferred from the Git author field.</w:t>
       </w:r>
     </w:p>
     <w:sectPr>

</xml_diff>